<commit_message>
APC 0710751-07: versão concisa (voto -39%, ementa -24%) e complemento com os autos
Co-Authored-By: Claude Sonnet 5.5 <noreply@anthropic.com>
Claude-Session: https://claude.ai/code/session_01TWDXEyfkWDEFim28t4uBEt
</commit_message>
<xml_diff>
--- a/entregas-0710751/9 APC 0710751-07 ACA Marcos NP danos morais tema 1085 stj.docx
+++ b/entregas-0710751/9 APC 0710751-07 ACA Marcos NP danos morais tema 1085 stj.docx
@@ -989,6 +989,7 @@
         </w:rPr>
       </w:pPr>
       <w:commentRangeStart w:id="2"/>
+      <w:commentRangeStart w:id="23"/>
       <w:r>
         <w:rPr>
           <w:rFonts w:ascii="Arial" w:eastAsia="Arial" w:hAnsi="Arial" w:cs="Arial"/>
@@ -1091,6 +1092,13 @@
           <w:rStyle w:val="CommentReference"/>
         </w:rPr>
         <w:commentReference w:id="2"/>
+      </w:r>
+      <w:commentRangeEnd w:id="23"/>
+      <w:r>
+        <w:rPr>
+          <w:rStyle w:val="CommentReference"/>
+        </w:rPr>
+        <w:commentReference w:id="23"/>
       </w:r>
     </w:p>
     <w:p>
@@ -1171,7 +1179,7 @@
           <w:sz w:val="28"/>
           <w:szCs w:val="28"/>
         </w:rPr>
-        <w:t xml:space="preserve">de indenização por danos morais proposta por consumidora pessoa natural</w:t>
+        <w:t xml:space="preserve">de indenização por danos morais de consumidora</w:t>
       </w:r>
       <w:r>
         <w:rPr>
@@ -1188,7 +1196,7 @@
           <w:sz w:val="28"/>
           <w:szCs w:val="28"/>
         </w:rPr>
-        <w:t xml:space="preserve">BRB Banco de Brasília S.A., em razão de descontos em conta de recebimento de salário para amortização de empréstimos (R$ 36.000,00). </w:t>
+        <w:t xml:space="preserve">BRB Banco de Brasília S.A., por descontos em conta de recebimento de salário para amortização de empréstimos (R$ 36.000,00). </w:t>
       </w:r>
     </w:p>
     <w:p>
@@ -1290,7 +1298,7 @@
           <w:sz w:val="28"/>
           <w:szCs w:val="28"/>
         </w:rPr>
-        <w:t xml:space="preserve">A autora apela sustentando que o Tema 1.085 do STJ foi aplicado sem exame individualizado dos lançamentos, que a retenção</w:t>
+        <w:t xml:space="preserve">A autora apela alegando aplicação indevida do Tema 1.085 do STJ, violação</w:t>
       </w:r>
       <w:r>
         <w:rPr>
@@ -1315,7 +1323,7 @@
           <w:sz w:val="28"/>
           <w:szCs w:val="28"/>
         </w:rPr>
-        <w:t xml:space="preserve">remuneração</w:t>
+        <w:t xml:space="preserve">boa-fé</w:t>
       </w:r>
       <w:r>
         <w:rPr>
@@ -1332,24 +1340,7 @@
           <w:sz w:val="28"/>
           <w:szCs w:val="28"/>
         </w:rPr>
-        <w:t xml:space="preserve">viola</w:t>
-      </w:r>
-      <w:r>
-        <w:rPr>
-          <w:rFonts w:ascii="Arial" w:eastAsia="Arial" w:hAnsi="Arial" w:cs="Arial"/>
-          <w:sz w:val="28"/>
-          <w:szCs w:val="28"/>
-        </w:rPr>
-        <w:t xml:space="preserve"> a </w:t>
-      </w:r>
-      <w:r>
-        <w:rPr>
-          <w:rFonts w:ascii="Arial" w:eastAsia="Arial" w:hAnsi="Arial" w:cs="Arial"/>
-          <w:color w:val="808080"/>
-          <w:sz w:val="28"/>
-          <w:szCs w:val="28"/>
-        </w:rPr>
-        <w:t xml:space="preserve">boa-fé</w:t>
+        <w:t xml:space="preserve">e</w:t>
       </w:r>
       <w:r>
         <w:rPr>
@@ -1366,6 +1357,57 @@
           <w:sz w:val="28"/>
           <w:szCs w:val="28"/>
         </w:rPr>
+        <w:t xml:space="preserve">do</w:t>
+      </w:r>
+      <w:r>
+        <w:rPr>
+          <w:rFonts w:ascii="Arial" w:eastAsia="Arial" w:hAnsi="Arial" w:cs="Arial"/>
+          <w:sz w:val="28"/>
+          <w:szCs w:val="28"/>
+        </w:rPr>
+        <w:t xml:space="preserve"> </w:t>
+      </w:r>
+      <w:r>
+        <w:rPr>
+          <w:rFonts w:ascii="Arial" w:eastAsia="Arial" w:hAnsi="Arial" w:cs="Arial"/>
+          <w:color w:val="808080"/>
+          <w:sz w:val="28"/>
+          <w:szCs w:val="28"/>
+        </w:rPr>
+        <w:t xml:space="preserve">mínimo</w:t>
+      </w:r>
+      <w:r>
+        <w:rPr>
+          <w:rFonts w:ascii="Arial" w:eastAsia="Arial" w:hAnsi="Arial" w:cs="Arial"/>
+          <w:sz w:val="28"/>
+          <w:szCs w:val="28"/>
+        </w:rPr>
+        <w:t xml:space="preserve"> </w:t>
+      </w:r>
+      <w:r>
+        <w:rPr>
+          <w:rFonts w:ascii="Arial" w:eastAsia="Arial" w:hAnsi="Arial" w:cs="Arial"/>
+          <w:color w:val="808080"/>
+          <w:sz w:val="28"/>
+          <w:szCs w:val="28"/>
+        </w:rPr>
+        <w:t xml:space="preserve">existencial</w:t>
+      </w:r>
+      <w:r>
+        <w:rPr>
+          <w:rFonts w:ascii="Arial" w:eastAsia="Arial" w:hAnsi="Arial" w:cs="Arial"/>
+          <w:sz w:val="28"/>
+          <w:szCs w:val="28"/>
+        </w:rPr>
+        <w:t xml:space="preserve"> </w:t>
+      </w:r>
+      <w:r>
+        <w:rPr>
+          <w:rFonts w:ascii="Arial" w:eastAsia="Arial" w:hAnsi="Arial" w:cs="Arial"/>
+          <w:color w:val="808080"/>
+          <w:sz w:val="28"/>
+          <w:szCs w:val="28"/>
+        </w:rPr>
         <w:t xml:space="preserve">e</w:t>
       </w:r>
       <w:r>
@@ -1383,7 +1425,7 @@
           <w:sz w:val="28"/>
           <w:szCs w:val="28"/>
         </w:rPr>
-        <w:t xml:space="preserve">o</w:t>
+        <w:t xml:space="preserve">dano</w:t>
       </w:r>
       <w:r>
         <w:rPr>
@@ -1400,7 +1442,7 @@
           <w:sz w:val="28"/>
           <w:szCs w:val="28"/>
         </w:rPr>
-        <w:t xml:space="preserve">mínimo existencial e que o dano moral está configurado</w:t>
+        <w:t xml:space="preserve">moral</w:t>
       </w:r>
       <w:r>
         <w:rPr>
@@ -1506,14 +1548,6 @@
           <w:sz w:val="28"/>
           <w:szCs w:val="28"/>
         </w:rPr>
-        <w:t xml:space="preserve"> verificar</w:t>
-      </w:r>
-      <w:r>
-        <w:rPr>
-          <w:rFonts w:ascii="Arial" w:eastAsia="Arial" w:hAnsi="Arial" w:cs="Arial"/>
-          <w:sz w:val="28"/>
-          <w:szCs w:val="28"/>
-        </w:rPr>
         <w:t xml:space="preserve"> </w:t>
       </w:r>
       <w:r>
@@ -1522,40 +1556,57 @@
           <w:sz w:val="28"/>
           <w:szCs w:val="28"/>
         </w:rPr>
-        <w:t xml:space="preserve">a licitude dos descontos promovidos pela instituição financeira em conta de recebimento de salário, à luz do Tema 1.085 do STJ; e (ii) </w:t>
-      </w:r>
-      <w:r>
-        <w:rPr>
-          <w:rFonts w:ascii="Arial" w:eastAsia="Arial" w:hAnsi="Arial" w:cs="Arial"/>
-          <w:sz w:val="28"/>
-          <w:szCs w:val="28"/>
-        </w:rPr>
-        <w:t xml:space="preserve">definir se </w:t>
-      </w:r>
-      <w:r>
-        <w:rPr>
-          <w:rFonts w:ascii="Arial" w:eastAsia="Arial" w:hAnsi="Arial" w:cs="Arial"/>
-          <w:color w:val="808080"/>
-          <w:sz w:val="28"/>
-          <w:szCs w:val="28"/>
-        </w:rPr>
-        <w:t xml:space="preserve">está</w:t>
-      </w:r>
-      <w:r>
-        <w:rPr>
-          <w:rFonts w:ascii="Arial" w:eastAsia="Arial" w:hAnsi="Arial" w:cs="Arial"/>
-          <w:sz w:val="28"/>
-          <w:szCs w:val="28"/>
-        </w:rPr>
-        <w:t xml:space="preserve"> configurado</w:t>
-      </w:r>
-      <w:r>
-        <w:rPr>
-          <w:rFonts w:ascii="Arial" w:eastAsia="Arial" w:hAnsi="Arial" w:cs="Arial"/>
-          <w:sz w:val="28"/>
-          <w:szCs w:val="28"/>
-        </w:rPr>
-        <w:t xml:space="preserve"> dano moral em razão do comprometimento da renda da autora.</w:t>
+        <w:t xml:space="preserve">licitude dos descontos</w:t>
+      </w:r>
+      <w:r>
+        <w:rPr>
+          <w:rFonts w:ascii="Arial" w:eastAsia="Arial" w:hAnsi="Arial" w:cs="Arial"/>
+          <w:sz w:val="28"/>
+          <w:szCs w:val="28"/>
+        </w:rPr>
+        <w:t xml:space="preserve"> em conta de recebimento de salário, à luz do Tema 1.085 do STJ; e (ii) </w:t>
+      </w:r>
+      <w:r>
+        <w:rPr>
+          <w:rFonts w:ascii="Arial" w:eastAsia="Arial" w:hAnsi="Arial" w:cs="Arial"/>
+          <w:color w:val="808080"/>
+          <w:sz w:val="28"/>
+          <w:szCs w:val="28"/>
+        </w:rPr>
+        <w:t xml:space="preserve">configuração</w:t>
+      </w:r>
+      <w:r>
+        <w:rPr>
+          <w:rFonts w:ascii="Arial" w:eastAsia="Arial" w:hAnsi="Arial" w:cs="Arial"/>
+          <w:sz w:val="28"/>
+          <w:szCs w:val="28"/>
+        </w:rPr>
+        <w:t xml:space="preserve"> </w:t>
+      </w:r>
+      <w:r>
+        <w:rPr>
+          <w:rFonts w:ascii="Arial" w:eastAsia="Arial" w:hAnsi="Arial" w:cs="Arial"/>
+          <w:color w:val="808080"/>
+          <w:sz w:val="28"/>
+          <w:szCs w:val="28"/>
+        </w:rPr>
+        <w:t xml:space="preserve">de</w:t>
+      </w:r>
+      <w:r>
+        <w:rPr>
+          <w:rFonts w:ascii="Arial" w:eastAsia="Arial" w:hAnsi="Arial" w:cs="Arial"/>
+          <w:sz w:val="28"/>
+          <w:szCs w:val="28"/>
+        </w:rPr>
+        <w:t xml:space="preserve"> dano moral</w:t>
+      </w:r>
+      <w:r>
+        <w:rPr>
+          <w:rFonts w:ascii="Arial" w:eastAsia="Arial" w:hAnsi="Arial" w:cs="Arial"/>
+          <w:sz w:val="28"/>
+          <w:szCs w:val="28"/>
+        </w:rPr>
+        <w:t xml:space="preserve">.</w:t>
       </w:r>
       <w:r>
         <w:rPr>
@@ -1642,7 +1693,7 @@
           <w:sz w:val="28"/>
           <w:szCs w:val="28"/>
         </w:rPr>
-        <w:t xml:space="preserve">de parcelas de empréstimos bancários comuns</w:t>
+        <w:t xml:space="preserve">de parcelas de empréstimos</w:t>
       </w:r>
       <w:r>
         <w:rPr>
@@ -1710,7 +1761,7 @@
           <w:sz w:val="28"/>
           <w:szCs w:val="28"/>
         </w:rPr>
-        <w:t xml:space="preserve">previamente autorizados pelo mutuário e enquanto a</w:t>
+        <w:t xml:space="preserve">previamente autorizados e enquanto a</w:t>
       </w:r>
       <w:r>
         <w:rPr>
@@ -1813,48 +1864,6 @@
           <w:sz w:val="28"/>
           <w:szCs w:val="28"/>
         </w:rPr>
-        <w:t xml:space="preserve"> Comprovado que os lançamentos impugnados</w:t>
-      </w:r>
-      <w:r>
-        <w:rPr>
-          <w:rFonts w:ascii="Arial" w:eastAsia="Arial" w:hAnsi="Arial" w:cs="Arial"/>
-          <w:color w:val="808080"/>
-          <w:sz w:val="28"/>
-          <w:szCs w:val="28"/>
-        </w:rPr>
-        <w:t xml:space="preserve">, de novembro de 2025 a abril de 2026,</w:t>
-      </w:r>
-      <w:r>
-        <w:rPr>
-          <w:rFonts w:ascii="Arial" w:eastAsia="Arial" w:hAnsi="Arial" w:cs="Arial"/>
-          <w:sz w:val="28"/>
-          <w:szCs w:val="28"/>
-        </w:rPr>
-        <w:t xml:space="preserve"> decorreram de obrigações</w:t>
-      </w:r>
-      <w:r>
-        <w:rPr>
-          <w:rFonts w:ascii="Arial" w:eastAsia="Arial" w:hAnsi="Arial" w:cs="Arial"/>
-          <w:sz w:val="28"/>
-          <w:szCs w:val="28"/>
-        </w:rPr>
-        <w:t xml:space="preserve"> assumidas pela consumidora e de autorizações contratuais </w:t>
-      </w:r>
-      <w:r>
-        <w:rPr>
-          <w:rFonts w:ascii="Arial" w:eastAsia="Arial" w:hAnsi="Arial" w:cs="Arial"/>
-          <w:color w:val="808080"/>
-          <w:sz w:val="28"/>
-          <w:szCs w:val="28"/>
-        </w:rPr>
-        <w:t xml:space="preserve">vigentes,</w:t>
-      </w:r>
-      <w:r>
-        <w:rPr>
-          <w:rFonts w:ascii="Arial" w:eastAsia="Arial" w:hAnsi="Arial" w:cs="Arial"/>
-          <w:sz w:val="28"/>
-          <w:szCs w:val="28"/>
-        </w:rPr>
         <w:t xml:space="preserve"> </w:t>
       </w:r>
       <w:r>
@@ -1864,15 +1873,219 @@
           <w:sz w:val="28"/>
           <w:szCs w:val="28"/>
         </w:rPr>
-        <w:t xml:space="preserve">pois o cancelamento só foi pedido em 16/04/2026</w:t>
-      </w:r>
-      <w:r>
-        <w:rPr>
-          <w:rFonts w:ascii="Arial" w:eastAsia="Arial" w:hAnsi="Arial" w:cs="Arial"/>
-          <w:sz w:val="28"/>
-          <w:szCs w:val="28"/>
-        </w:rPr>
-        <w:t xml:space="preserve">, não se verifica conduta ilícita da instituição financeira.</w:t>
+        <w:t xml:space="preserve">Os</w:t>
+      </w:r>
+      <w:r>
+        <w:rPr>
+          <w:rFonts w:ascii="Arial" w:eastAsia="Arial" w:hAnsi="Arial" w:cs="Arial"/>
+          <w:sz w:val="28"/>
+          <w:szCs w:val="28"/>
+        </w:rPr>
+        <w:t xml:space="preserve"> lançamentos </w:t>
+      </w:r>
+      <w:r>
+        <w:rPr>
+          <w:rFonts w:ascii="Arial" w:eastAsia="Arial" w:hAnsi="Arial" w:cs="Arial"/>
+          <w:color w:val="808080"/>
+          <w:sz w:val="28"/>
+          <w:szCs w:val="28"/>
+        </w:rPr>
+        <w:t xml:space="preserve">de novembro de 2025 a abril de 2026</w:t>
+      </w:r>
+      <w:r>
+        <w:rPr>
+          <w:rFonts w:ascii="Arial" w:eastAsia="Arial" w:hAnsi="Arial" w:cs="Arial"/>
+          <w:sz w:val="28"/>
+          <w:szCs w:val="28"/>
+        </w:rPr>
+        <w:t xml:space="preserve"> decorreram de </w:t>
+      </w:r>
+      <w:r>
+        <w:rPr>
+          <w:rFonts w:ascii="Arial" w:eastAsia="Arial" w:hAnsi="Arial" w:cs="Arial"/>
+          <w:color w:val="808080"/>
+          <w:sz w:val="28"/>
+          <w:szCs w:val="28"/>
+        </w:rPr>
+        <w:t xml:space="preserve">autorização</w:t>
+      </w:r>
+      <w:r>
+        <w:rPr>
+          <w:rFonts w:ascii="Arial" w:eastAsia="Arial" w:hAnsi="Arial" w:cs="Arial"/>
+          <w:sz w:val="28"/>
+          <w:szCs w:val="28"/>
+        </w:rPr>
+        <w:t xml:space="preserve"> </w:t>
+      </w:r>
+      <w:r>
+        <w:rPr>
+          <w:rFonts w:ascii="Arial" w:eastAsia="Arial" w:hAnsi="Arial" w:cs="Arial"/>
+          <w:color w:val="808080"/>
+          <w:sz w:val="28"/>
+          <w:szCs w:val="28"/>
+        </w:rPr>
+        <w:t xml:space="preserve">contratual</w:t>
+      </w:r>
+      <w:r>
+        <w:rPr>
+          <w:rFonts w:ascii="Arial" w:eastAsia="Arial" w:hAnsi="Arial" w:cs="Arial"/>
+          <w:sz w:val="28"/>
+          <w:szCs w:val="28"/>
+        </w:rPr>
+        <w:t xml:space="preserve"> </w:t>
+      </w:r>
+      <w:r>
+        <w:rPr>
+          <w:rFonts w:ascii="Arial" w:eastAsia="Arial" w:hAnsi="Arial" w:cs="Arial"/>
+          <w:color w:val="808080"/>
+          <w:sz w:val="28"/>
+          <w:szCs w:val="28"/>
+        </w:rPr>
+        <w:t xml:space="preserve">vigente</w:t>
+      </w:r>
+      <w:r>
+        <w:rPr>
+          <w:rFonts w:ascii="Arial" w:eastAsia="Arial" w:hAnsi="Arial" w:cs="Arial"/>
+          <w:sz w:val="28"/>
+          <w:szCs w:val="28"/>
+        </w:rPr>
+        <w:t xml:space="preserve">, </w:t>
+      </w:r>
+      <w:r>
+        <w:rPr>
+          <w:rFonts w:ascii="Arial" w:eastAsia="Arial" w:hAnsi="Arial" w:cs="Arial"/>
+          <w:color w:val="808080"/>
+          <w:sz w:val="28"/>
+          <w:szCs w:val="28"/>
+        </w:rPr>
+        <w:t xml:space="preserve">pois</w:t>
+      </w:r>
+      <w:r>
+        <w:rPr>
+          <w:rFonts w:ascii="Arial" w:eastAsia="Arial" w:hAnsi="Arial" w:cs="Arial"/>
+          <w:sz w:val="28"/>
+          <w:szCs w:val="28"/>
+        </w:rPr>
+        <w:t xml:space="preserve"> </w:t>
+      </w:r>
+      <w:r>
+        <w:rPr>
+          <w:rFonts w:ascii="Arial" w:eastAsia="Arial" w:hAnsi="Arial" w:cs="Arial"/>
+          <w:color w:val="808080"/>
+          <w:sz w:val="28"/>
+          <w:szCs w:val="28"/>
+        </w:rPr>
+        <w:t xml:space="preserve">o</w:t>
+      </w:r>
+      <w:r>
+        <w:rPr>
+          <w:rFonts w:ascii="Arial" w:eastAsia="Arial" w:hAnsi="Arial" w:cs="Arial"/>
+          <w:sz w:val="28"/>
+          <w:szCs w:val="28"/>
+        </w:rPr>
+        <w:t xml:space="preserve"> </w:t>
+      </w:r>
+      <w:r>
+        <w:rPr>
+          <w:rFonts w:ascii="Arial" w:eastAsia="Arial" w:hAnsi="Arial" w:cs="Arial"/>
+          <w:color w:val="808080"/>
+          <w:sz w:val="28"/>
+          <w:szCs w:val="28"/>
+        </w:rPr>
+        <w:t xml:space="preserve">cancelamento</w:t>
+      </w:r>
+      <w:r>
+        <w:rPr>
+          <w:rFonts w:ascii="Arial" w:eastAsia="Arial" w:hAnsi="Arial" w:cs="Arial"/>
+          <w:sz w:val="28"/>
+          <w:szCs w:val="28"/>
+        </w:rPr>
+        <w:t xml:space="preserve"> </w:t>
+      </w:r>
+      <w:r>
+        <w:rPr>
+          <w:rFonts w:ascii="Arial" w:eastAsia="Arial" w:hAnsi="Arial" w:cs="Arial"/>
+          <w:color w:val="808080"/>
+          <w:sz w:val="28"/>
+          <w:szCs w:val="28"/>
+        </w:rPr>
+        <w:t xml:space="preserve">só</w:t>
+      </w:r>
+      <w:r>
+        <w:rPr>
+          <w:rFonts w:ascii="Arial" w:eastAsia="Arial" w:hAnsi="Arial" w:cs="Arial"/>
+          <w:sz w:val="28"/>
+          <w:szCs w:val="28"/>
+        </w:rPr>
+        <w:t xml:space="preserve"> </w:t>
+      </w:r>
+      <w:r>
+        <w:rPr>
+          <w:rFonts w:ascii="Arial" w:eastAsia="Arial" w:hAnsi="Arial" w:cs="Arial"/>
+          <w:color w:val="808080"/>
+          <w:sz w:val="28"/>
+          <w:szCs w:val="28"/>
+        </w:rPr>
+        <w:t xml:space="preserve">foi</w:t>
+      </w:r>
+      <w:r>
+        <w:rPr>
+          <w:rFonts w:ascii="Arial" w:eastAsia="Arial" w:hAnsi="Arial" w:cs="Arial"/>
+          <w:sz w:val="28"/>
+          <w:szCs w:val="28"/>
+        </w:rPr>
+        <w:t xml:space="preserve"> </w:t>
+      </w:r>
+      <w:r>
+        <w:rPr>
+          <w:rFonts w:ascii="Arial" w:eastAsia="Arial" w:hAnsi="Arial" w:cs="Arial"/>
+          <w:color w:val="808080"/>
+          <w:sz w:val="28"/>
+          <w:szCs w:val="28"/>
+        </w:rPr>
+        <w:t xml:space="preserve">pedido</w:t>
+      </w:r>
+      <w:r>
+        <w:rPr>
+          <w:rFonts w:ascii="Arial" w:eastAsia="Arial" w:hAnsi="Arial" w:cs="Arial"/>
+          <w:sz w:val="28"/>
+          <w:szCs w:val="28"/>
+        </w:rPr>
+        <w:t xml:space="preserve"> </w:t>
+      </w:r>
+      <w:r>
+        <w:rPr>
+          <w:rFonts w:ascii="Arial" w:eastAsia="Arial" w:hAnsi="Arial" w:cs="Arial"/>
+          <w:color w:val="808080"/>
+          <w:sz w:val="28"/>
+          <w:szCs w:val="28"/>
+        </w:rPr>
+        <w:t xml:space="preserve">em</w:t>
+      </w:r>
+      <w:r>
+        <w:rPr>
+          <w:rFonts w:ascii="Arial" w:eastAsia="Arial" w:hAnsi="Arial" w:cs="Arial"/>
+          <w:sz w:val="28"/>
+          <w:szCs w:val="28"/>
+        </w:rPr>
+        <w:t xml:space="preserve"> </w:t>
+      </w:r>
+      <w:r>
+        <w:rPr>
+          <w:rFonts w:ascii="Arial" w:eastAsia="Arial" w:hAnsi="Arial" w:cs="Arial"/>
+          <w:color w:val="808080"/>
+          <w:sz w:val="28"/>
+          <w:szCs w:val="28"/>
+        </w:rPr>
+        <w:t xml:space="preserve">16/04/2026, o que afasta ato ilícito</w:t>
+      </w:r>
+      <w:r>
+        <w:rPr>
+          <w:rFonts w:ascii="Arial" w:eastAsia="Arial" w:hAnsi="Arial" w:cs="Arial"/>
+          <w:sz w:val="28"/>
+          <w:szCs w:val="28"/>
+        </w:rPr>
+        <w:t xml:space="preserve">.</w:t>
       </w:r>
       <w:commentRangeEnd w:id="5"/>
       <w:r>
@@ -1913,44 +2126,198 @@
       <w:r>
         <w:rPr>
           <w:rFonts w:ascii="Arial" w:eastAsia="Arial" w:hAnsi="Arial" w:cs="Arial"/>
-          <w:sz w:val="28"/>
-          <w:szCs w:val="28"/>
-        </w:rPr>
-        <w:t xml:space="preserve">A retenção de valores em conta para amortização de dívida </w:t>
-      </w:r>
-      <w:r>
-        <w:rPr>
-          <w:rFonts w:ascii="Arial" w:eastAsia="Arial" w:hAnsi="Arial" w:cs="Arial"/>
-          <w:sz w:val="28"/>
-          <w:szCs w:val="28"/>
-        </w:rPr>
-        <w:t xml:space="preserve">contratada, em observância às autorizações </w:t>
-      </w:r>
-      <w:r>
-        <w:rPr>
-          <w:rFonts w:ascii="Arial" w:eastAsia="Arial" w:hAnsi="Arial" w:cs="Arial"/>
-          <w:color w:val="808080"/>
-          <w:sz w:val="28"/>
-          <w:szCs w:val="28"/>
-        </w:rPr>
-        <w:t xml:space="preserve">do</w:t>
-      </w:r>
-      <w:r>
-        <w:rPr>
-          <w:rFonts w:ascii="Arial" w:eastAsia="Arial" w:hAnsi="Arial" w:cs="Arial"/>
-          <w:sz w:val="28"/>
-          <w:szCs w:val="28"/>
-        </w:rPr>
-        <w:t xml:space="preserve"> correntista, não enseja reparação por danos morais</w:t>
-      </w:r>
-      <w:r>
-        <w:rPr>
-          <w:rFonts w:ascii="Arial" w:eastAsia="Arial" w:hAnsi="Arial" w:cs="Arial"/>
-          <w:color w:val="808080"/>
-          <w:sz w:val="28"/>
-          <w:szCs w:val="28"/>
-        </w:rPr>
-        <w:t xml:space="preserve">, e o comprometimento da renda não autoriza a transposição automática do mínimo existencial para a via indenizatória</w:t>
+          <w:color w:val="808080"/>
+          <w:sz w:val="28"/>
+          <w:szCs w:val="28"/>
+        </w:rPr>
+        <w:t xml:space="preserve">O</w:t>
+      </w:r>
+      <w:r>
+        <w:rPr>
+          <w:rFonts w:ascii="Arial" w:eastAsia="Arial" w:hAnsi="Arial" w:cs="Arial"/>
+          <w:sz w:val="28"/>
+          <w:szCs w:val="28"/>
+        </w:rPr>
+        <w:t xml:space="preserve"> </w:t>
+      </w:r>
+      <w:r>
+        <w:rPr>
+          <w:rFonts w:ascii="Arial" w:eastAsia="Arial" w:hAnsi="Arial" w:cs="Arial"/>
+          <w:color w:val="808080"/>
+          <w:sz w:val="28"/>
+          <w:szCs w:val="28"/>
+        </w:rPr>
+        <w:t xml:space="preserve">comprometimento</w:t>
+      </w:r>
+      <w:r>
+        <w:rPr>
+          <w:rFonts w:ascii="Arial" w:eastAsia="Arial" w:hAnsi="Arial" w:cs="Arial"/>
+          <w:sz w:val="28"/>
+          <w:szCs w:val="28"/>
+        </w:rPr>
+        <w:t xml:space="preserve"> </w:t>
+      </w:r>
+      <w:r>
+        <w:rPr>
+          <w:rFonts w:ascii="Arial" w:eastAsia="Arial" w:hAnsi="Arial" w:cs="Arial"/>
+          <w:color w:val="808080"/>
+          <w:sz w:val="28"/>
+          <w:szCs w:val="28"/>
+        </w:rPr>
+        <w:t xml:space="preserve">da</w:t>
+      </w:r>
+      <w:r>
+        <w:rPr>
+          <w:rFonts w:ascii="Arial" w:eastAsia="Arial" w:hAnsi="Arial" w:cs="Arial"/>
+          <w:sz w:val="28"/>
+          <w:szCs w:val="28"/>
+        </w:rPr>
+        <w:t xml:space="preserve"> </w:t>
+      </w:r>
+      <w:r>
+        <w:rPr>
+          <w:rFonts w:ascii="Arial" w:eastAsia="Arial" w:hAnsi="Arial" w:cs="Arial"/>
+          <w:color w:val="808080"/>
+          <w:sz w:val="28"/>
+          <w:szCs w:val="28"/>
+        </w:rPr>
+        <w:t xml:space="preserve">renda</w:t>
+      </w:r>
+      <w:r>
+        <w:rPr>
+          <w:rFonts w:ascii="Arial" w:eastAsia="Arial" w:hAnsi="Arial" w:cs="Arial"/>
+          <w:sz w:val="28"/>
+          <w:szCs w:val="28"/>
+        </w:rPr>
+        <w:t xml:space="preserve">, </w:t>
+      </w:r>
+      <w:r>
+        <w:rPr>
+          <w:rFonts w:ascii="Arial" w:eastAsia="Arial" w:hAnsi="Arial" w:cs="Arial"/>
+          <w:color w:val="808080"/>
+          <w:sz w:val="28"/>
+          <w:szCs w:val="28"/>
+        </w:rPr>
+        <w:t xml:space="preserve">por</w:t>
+      </w:r>
+      <w:r>
+        <w:rPr>
+          <w:rFonts w:ascii="Arial" w:eastAsia="Arial" w:hAnsi="Arial" w:cs="Arial"/>
+          <w:sz w:val="28"/>
+          <w:szCs w:val="28"/>
+        </w:rPr>
+        <w:t xml:space="preserve"> </w:t>
+      </w:r>
+      <w:r>
+        <w:rPr>
+          <w:rFonts w:ascii="Arial" w:eastAsia="Arial" w:hAnsi="Arial" w:cs="Arial"/>
+          <w:color w:val="808080"/>
+          <w:sz w:val="28"/>
+          <w:szCs w:val="28"/>
+        </w:rPr>
+        <w:t xml:space="preserve">si</w:t>
+      </w:r>
+      <w:r>
+        <w:rPr>
+          <w:rFonts w:ascii="Arial" w:eastAsia="Arial" w:hAnsi="Arial" w:cs="Arial"/>
+          <w:sz w:val="28"/>
+          <w:szCs w:val="28"/>
+        </w:rPr>
+        <w:t xml:space="preserve"> </w:t>
+      </w:r>
+      <w:r>
+        <w:rPr>
+          <w:rFonts w:ascii="Arial" w:eastAsia="Arial" w:hAnsi="Arial" w:cs="Arial"/>
+          <w:color w:val="808080"/>
+          <w:sz w:val="28"/>
+          <w:szCs w:val="28"/>
+        </w:rPr>
+        <w:t xml:space="preserve">só</w:t>
+      </w:r>
+      <w:r>
+        <w:rPr>
+          <w:rFonts w:ascii="Arial" w:eastAsia="Arial" w:hAnsi="Arial" w:cs="Arial"/>
+          <w:sz w:val="28"/>
+          <w:szCs w:val="28"/>
+        </w:rPr>
+        <w:t xml:space="preserve">, não </w:t>
+      </w:r>
+      <w:r>
+        <w:rPr>
+          <w:rFonts w:ascii="Arial" w:eastAsia="Arial" w:hAnsi="Arial" w:cs="Arial"/>
+          <w:color w:val="808080"/>
+          <w:sz w:val="28"/>
+          <w:szCs w:val="28"/>
+        </w:rPr>
+        <w:t xml:space="preserve">gera</w:t>
+      </w:r>
+      <w:r>
+        <w:rPr>
+          <w:rFonts w:ascii="Arial" w:eastAsia="Arial" w:hAnsi="Arial" w:cs="Arial"/>
+          <w:sz w:val="28"/>
+          <w:szCs w:val="28"/>
+        </w:rPr>
+        <w:t xml:space="preserve"> </w:t>
+      </w:r>
+      <w:r>
+        <w:rPr>
+          <w:rFonts w:ascii="Arial" w:eastAsia="Arial" w:hAnsi="Arial" w:cs="Arial"/>
+          <w:color w:val="808080"/>
+          <w:sz w:val="28"/>
+          <w:szCs w:val="28"/>
+        </w:rPr>
+        <w:t xml:space="preserve">dano</w:t>
+      </w:r>
+      <w:r>
+        <w:rPr>
+          <w:rFonts w:ascii="Arial" w:eastAsia="Arial" w:hAnsi="Arial" w:cs="Arial"/>
+          <w:sz w:val="28"/>
+          <w:szCs w:val="28"/>
+        </w:rPr>
+        <w:t xml:space="preserve"> </w:t>
+      </w:r>
+      <w:r>
+        <w:rPr>
+          <w:rFonts w:ascii="Arial" w:eastAsia="Arial" w:hAnsi="Arial" w:cs="Arial"/>
+          <w:color w:val="808080"/>
+          <w:sz w:val="28"/>
+          <w:szCs w:val="28"/>
+        </w:rPr>
+        <w:t xml:space="preserve">moral,</w:t>
+      </w:r>
+      <w:r>
+        <w:rPr>
+          <w:rFonts w:ascii="Arial" w:eastAsia="Arial" w:hAnsi="Arial" w:cs="Arial"/>
+          <w:sz w:val="28"/>
+          <w:szCs w:val="28"/>
+        </w:rPr>
+        <w:t xml:space="preserve"> </w:t>
+      </w:r>
+      <w:r>
+        <w:rPr>
+          <w:rFonts w:ascii="Arial" w:eastAsia="Arial" w:hAnsi="Arial" w:cs="Arial"/>
+          <w:color w:val="808080"/>
+          <w:sz w:val="28"/>
+          <w:szCs w:val="28"/>
+        </w:rPr>
+        <w:t xml:space="preserve">e</w:t>
+      </w:r>
+      <w:r>
+        <w:rPr>
+          <w:rFonts w:ascii="Arial" w:eastAsia="Arial" w:hAnsi="Arial" w:cs="Arial"/>
+          <w:sz w:val="28"/>
+          <w:szCs w:val="28"/>
+        </w:rPr>
+        <w:t xml:space="preserve"> </w:t>
+      </w:r>
+      <w:r>
+        <w:rPr>
+          <w:rFonts w:ascii="Arial" w:eastAsia="Arial" w:hAnsi="Arial" w:cs="Arial"/>
+          <w:color w:val="808080"/>
+          <w:sz w:val="28"/>
+          <w:szCs w:val="28"/>
+        </w:rPr>
+        <w:t xml:space="preserve">o mínimo existencial não se transpõe automaticamente para a via indenizatória</w:t>
       </w:r>
       <w:r>
         <w:rPr>
@@ -4689,10 +5056,11 @@
       <w:r>
         <w:rPr>
           <w:rFonts w:ascii="Arial" w:hAnsi="Arial" w:cs="Arial"/>
-          <w:sz w:val="28"/>
-          <w:szCs w:val="28"/>
-        </w:rPr>
-        <w:t xml:space="preserve">26</w:t>
+          <w:color w:val="808080"/>
+          <w:sz w:val="28"/>
+          <w:szCs w:val="28"/>
+        </w:rPr>
+        <w:t xml:space="preserve">08</w:t>
       </w:r>
       <w:r>
         <w:rPr>
@@ -4705,18 +5073,11 @@
       <w:r>
         <w:rPr>
           <w:rFonts w:ascii="Arial" w:hAnsi="Arial" w:cs="Arial"/>
-          <w:sz w:val="28"/>
-          <w:szCs w:val="28"/>
-        </w:rPr>
-        <w:t xml:space="preserve">0</w:t>
-      </w:r>
-      <w:r>
-        <w:rPr>
-          <w:rFonts w:ascii="Arial" w:hAnsi="Arial" w:cs="Arial"/>
-          <w:sz w:val="28"/>
-          <w:szCs w:val="28"/>
-        </w:rPr>
-        <w:t xml:space="preserve">5</w:t>
+          <w:color w:val="808080"/>
+          <w:sz w:val="28"/>
+          <w:szCs w:val="28"/>
+        </w:rPr>
+        <w:t xml:space="preserve">07</w:t>
       </w:r>
       <w:r>
         <w:rPr>
@@ -5243,32 +5604,100 @@
           <w:sz w:val="28"/>
           <w:szCs w:val="28"/>
         </w:rPr>
+        <w:t xml:space="preserve"> o Tema 1.085 do STJ</w:t>
+      </w:r>
+      <w:r>
+        <w:rPr>
+          <w:rFonts w:ascii="Arial" w:eastAsia="Arial" w:hAnsi="Arial" w:cs="Arial"/>
+          <w:color w:val="808080"/>
+          <w:sz w:val="28"/>
+          <w:szCs w:val="28"/>
+        </w:rPr>
+        <w:t xml:space="preserve"> foi aplicado</w:t>
+      </w:r>
+      <w:r>
+        <w:rPr>
+          <w:rFonts w:ascii="Arial" w:eastAsia="Arial" w:hAnsi="Arial" w:cs="Arial"/>
+          <w:sz w:val="28"/>
+          <w:szCs w:val="28"/>
+        </w:rPr>
+        <w:t xml:space="preserve"> sem </w:t>
+      </w:r>
+      <w:r>
+        <w:rPr>
+          <w:rFonts w:ascii="Arial" w:eastAsia="Arial" w:hAnsi="Arial" w:cs="Arial"/>
+          <w:color w:val="808080"/>
+          <w:sz w:val="28"/>
+          <w:szCs w:val="28"/>
+        </w:rPr>
+        <w:t xml:space="preserve">exame</w:t>
+      </w:r>
+      <w:r>
+        <w:rPr>
+          <w:rFonts w:ascii="Arial" w:eastAsia="Arial" w:hAnsi="Arial" w:cs="Arial"/>
+          <w:sz w:val="28"/>
+          <w:szCs w:val="28"/>
+        </w:rPr>
         <w:t xml:space="preserve"> </w:t>
       </w:r>
       <w:r>
         <w:rPr>
           <w:rFonts w:ascii="Arial" w:eastAsia="Arial" w:hAnsi="Arial" w:cs="Arial"/>
-          <w:sz w:val="28"/>
-          <w:szCs w:val="28"/>
-        </w:rPr>
-        <w:t xml:space="preserve">a sentença aplicou </w:t>
-      </w:r>
-      <w:r>
-        <w:rPr>
-          <w:rFonts w:ascii="Arial" w:eastAsia="Arial" w:hAnsi="Arial" w:cs="Arial"/>
-          <w:color w:val="808080"/>
-          <w:sz w:val="28"/>
-          <w:szCs w:val="28"/>
-        </w:rPr>
-        <w:t xml:space="preserve">indevidamente</w:t>
-      </w:r>
-      <w:r>
-        <w:rPr>
-          <w:rFonts w:ascii="Arial" w:eastAsia="Arial" w:hAnsi="Arial" w:cs="Arial"/>
-          <w:sz w:val="28"/>
-          <w:szCs w:val="28"/>
-        </w:rPr>
-        <w:t xml:space="preserve"> o Tema 1.085 do STJ, sem analisar, de forma individualizada, a origem, a natureza e a autorização </w:t>
+          <w:color w:val="808080"/>
+          <w:sz w:val="28"/>
+          <w:szCs w:val="28"/>
+        </w:rPr>
+        <w:t xml:space="preserve">individualizado</w:t>
+      </w:r>
+      <w:r>
+        <w:rPr>
+          <w:rFonts w:ascii="Arial" w:eastAsia="Arial" w:hAnsi="Arial" w:cs="Arial"/>
+          <w:sz w:val="28"/>
+          <w:szCs w:val="28"/>
+        </w:rPr>
+        <w:t xml:space="preserve"> </w:t>
+      </w:r>
+      <w:r>
+        <w:rPr>
+          <w:rFonts w:ascii="Arial" w:eastAsia="Arial" w:hAnsi="Arial" w:cs="Arial"/>
+          <w:color w:val="808080"/>
+          <w:sz w:val="28"/>
+          <w:szCs w:val="28"/>
+        </w:rPr>
+        <w:t xml:space="preserve">da</w:t>
+      </w:r>
+      <w:r>
+        <w:rPr>
+          <w:rFonts w:ascii="Arial" w:eastAsia="Arial" w:hAnsi="Arial" w:cs="Arial"/>
+          <w:sz w:val="28"/>
+          <w:szCs w:val="28"/>
+        </w:rPr>
+        <w:t xml:space="preserve"> origem</w:t>
+      </w:r>
+      <w:r>
+        <w:rPr>
+          <w:rFonts w:ascii="Arial" w:eastAsia="Arial" w:hAnsi="Arial" w:cs="Arial"/>
+          <w:sz w:val="28"/>
+          <w:szCs w:val="28"/>
+        </w:rPr>
+        <w:t xml:space="preserve"> e </w:t>
+      </w:r>
+      <w:r>
+        <w:rPr>
+          <w:rFonts w:ascii="Arial" w:eastAsia="Arial" w:hAnsi="Arial" w:cs="Arial"/>
+          <w:color w:val="808080"/>
+          <w:sz w:val="28"/>
+          <w:szCs w:val="28"/>
+        </w:rPr>
+        <w:t xml:space="preserve">da</w:t>
+      </w:r>
+      <w:r>
+        <w:rPr>
+          <w:rFonts w:ascii="Arial" w:eastAsia="Arial" w:hAnsi="Arial" w:cs="Arial"/>
+          <w:sz w:val="28"/>
+          <w:szCs w:val="28"/>
+        </w:rPr>
+        <w:t xml:space="preserve"> autorização </w:t>
       </w:r>
       <w:r>
         <w:rPr>
@@ -5303,49 +5732,143 @@
           <w:sz w:val="28"/>
           <w:szCs w:val="28"/>
         </w:rPr>
-        <w:t xml:space="preserve"> o</w:t>
-      </w:r>
-      <w:r>
-        <w:rPr>
-          <w:rFonts w:ascii="Arial" w:eastAsia="Arial" w:hAnsi="Arial" w:cs="Arial"/>
-          <w:sz w:val="28"/>
-          <w:szCs w:val="28"/>
-        </w:rPr>
-        <w:t xml:space="preserve">s valores salariais eram absorvidos automaticamente para amortização das dívidas, </w:t>
-      </w:r>
-      <w:r>
-        <w:rPr>
-          <w:rFonts w:ascii="Arial" w:eastAsia="Arial" w:hAnsi="Arial" w:cs="Arial"/>
-          <w:color w:val="808080"/>
-          <w:sz w:val="28"/>
-          <w:szCs w:val="28"/>
-        </w:rPr>
-        <w:t xml:space="preserve">com</w:t>
-      </w:r>
-      <w:r>
-        <w:rPr>
-          <w:rFonts w:ascii="Arial" w:eastAsia="Arial" w:hAnsi="Arial" w:cs="Arial"/>
-          <w:sz w:val="28"/>
-          <w:szCs w:val="28"/>
-        </w:rPr>
-        <w:t xml:space="preserve"> provisionamento</w:t>
-      </w:r>
-      <w:r>
-        <w:rPr>
-          <w:rFonts w:ascii="Arial" w:eastAsia="Arial" w:hAnsi="Arial" w:cs="Arial"/>
-          <w:sz w:val="28"/>
-          <w:szCs w:val="28"/>
-        </w:rPr>
-        <w:t xml:space="preserve"> sobre créditos futuros</w:t>
-      </w:r>
-      <w:r>
-        <w:rPr>
-          <w:rFonts w:ascii="Arial" w:eastAsia="Arial" w:hAnsi="Arial" w:cs="Arial"/>
-          <w:color w:val="808080"/>
-          <w:sz w:val="28"/>
-          <w:szCs w:val="28"/>
-        </w:rPr>
-        <w:t xml:space="preserve">, em afronta à boa-fé objetiva, à função social do contrato</w:t>
+        <w:t xml:space="preserve"> </w:t>
+      </w:r>
+      <w:r>
+        <w:rPr>
+          <w:rFonts w:ascii="Arial" w:eastAsia="Arial" w:hAnsi="Arial" w:cs="Arial"/>
+          <w:color w:val="808080"/>
+          <w:sz w:val="28"/>
+          <w:szCs w:val="28"/>
+        </w:rPr>
+        <w:t xml:space="preserve">o</w:t>
+      </w:r>
+      <w:r>
+        <w:rPr>
+          <w:rFonts w:ascii="Arial" w:eastAsia="Arial" w:hAnsi="Arial" w:cs="Arial"/>
+          <w:sz w:val="28"/>
+          <w:szCs w:val="28"/>
+        </w:rPr>
+        <w:t xml:space="preserve"> </w:t>
+      </w:r>
+      <w:r>
+        <w:rPr>
+          <w:rFonts w:ascii="Arial" w:eastAsia="Arial" w:hAnsi="Arial" w:cs="Arial"/>
+          <w:color w:val="808080"/>
+          <w:sz w:val="28"/>
+          <w:szCs w:val="28"/>
+        </w:rPr>
+        <w:t xml:space="preserve">banco</w:t>
+      </w:r>
+      <w:r>
+        <w:rPr>
+          <w:rFonts w:ascii="Arial" w:eastAsia="Arial" w:hAnsi="Arial" w:cs="Arial"/>
+          <w:sz w:val="28"/>
+          <w:szCs w:val="28"/>
+        </w:rPr>
+        <w:t xml:space="preserve"> </w:t>
+      </w:r>
+      <w:r>
+        <w:rPr>
+          <w:rFonts w:ascii="Arial" w:eastAsia="Arial" w:hAnsi="Arial" w:cs="Arial"/>
+          <w:color w:val="808080"/>
+          <w:sz w:val="28"/>
+          <w:szCs w:val="28"/>
+        </w:rPr>
+        <w:t xml:space="preserve">absorveu</w:t>
+      </w:r>
+      <w:r>
+        <w:rPr>
+          <w:rFonts w:ascii="Arial" w:eastAsia="Arial" w:hAnsi="Arial" w:cs="Arial"/>
+          <w:sz w:val="28"/>
+          <w:szCs w:val="28"/>
+        </w:rPr>
+        <w:t xml:space="preserve"> </w:t>
+      </w:r>
+      <w:r>
+        <w:rPr>
+          <w:rFonts w:ascii="Arial" w:eastAsia="Arial" w:hAnsi="Arial" w:cs="Arial"/>
+          <w:color w:val="808080"/>
+          <w:sz w:val="28"/>
+          <w:szCs w:val="28"/>
+        </w:rPr>
+        <w:t xml:space="preserve">o</w:t>
+      </w:r>
+      <w:r>
+        <w:rPr>
+          <w:rFonts w:ascii="Arial" w:eastAsia="Arial" w:hAnsi="Arial" w:cs="Arial"/>
+          <w:sz w:val="28"/>
+          <w:szCs w:val="28"/>
+        </w:rPr>
+        <w:t xml:space="preserve"> </w:t>
+      </w:r>
+      <w:r>
+        <w:rPr>
+          <w:rFonts w:ascii="Arial" w:eastAsia="Arial" w:hAnsi="Arial" w:cs="Arial"/>
+          <w:color w:val="808080"/>
+          <w:sz w:val="28"/>
+          <w:szCs w:val="28"/>
+        </w:rPr>
+        <w:t xml:space="preserve">salário</w:t>
+      </w:r>
+      <w:r>
+        <w:rPr>
+          <w:rFonts w:ascii="Arial" w:eastAsia="Arial" w:hAnsi="Arial" w:cs="Arial"/>
+          <w:sz w:val="28"/>
+          <w:szCs w:val="28"/>
+        </w:rPr>
+        <w:t xml:space="preserve"> </w:t>
+      </w:r>
+      <w:r>
+        <w:rPr>
+          <w:rFonts w:ascii="Arial" w:eastAsia="Arial" w:hAnsi="Arial" w:cs="Arial"/>
+          <w:color w:val="808080"/>
+          <w:sz w:val="28"/>
+          <w:szCs w:val="28"/>
+        </w:rPr>
+        <w:t xml:space="preserve">e</w:t>
+      </w:r>
+      <w:r>
+        <w:rPr>
+          <w:rFonts w:ascii="Arial" w:eastAsia="Arial" w:hAnsi="Arial" w:cs="Arial"/>
+          <w:sz w:val="28"/>
+          <w:szCs w:val="28"/>
+        </w:rPr>
+        <w:t xml:space="preserve"> </w:t>
+      </w:r>
+      <w:r>
+        <w:rPr>
+          <w:rFonts w:ascii="Arial" w:eastAsia="Arial" w:hAnsi="Arial" w:cs="Arial"/>
+          <w:color w:val="808080"/>
+          <w:sz w:val="28"/>
+          <w:szCs w:val="28"/>
+        </w:rPr>
+        <w:t xml:space="preserve">provisionou</w:t>
+      </w:r>
+      <w:r>
+        <w:rPr>
+          <w:rFonts w:ascii="Arial" w:eastAsia="Arial" w:hAnsi="Arial" w:cs="Arial"/>
+          <w:sz w:val="28"/>
+          <w:szCs w:val="28"/>
+        </w:rPr>
+        <w:t xml:space="preserve"> créditos futuros</w:t>
+      </w:r>
+      <w:r>
+        <w:rPr>
+          <w:rFonts w:ascii="Arial" w:eastAsia="Arial" w:hAnsi="Arial" w:cs="Arial"/>
+          <w:color w:val="808080"/>
+          <w:sz w:val="28"/>
+          <w:szCs w:val="28"/>
+        </w:rPr>
+        <w:t xml:space="preserve">, em afronta à boa-fé e ao mínimo existencial</w:t>
+      </w:r>
+      <w:r>
+        <w:rPr>
+          <w:rFonts w:ascii="Arial" w:eastAsia="Arial" w:hAnsi="Arial" w:cs="Arial"/>
+          <w:sz w:val="28"/>
+          <w:szCs w:val="28"/>
+        </w:rPr>
+        <w:t xml:space="preserve">;</w:t>
       </w:r>
       <w:r>
         <w:rPr>
@@ -5354,15 +5877,6 @@
           <w:szCs w:val="28"/>
         </w:rPr>
         <w:t xml:space="preserve"> e</w:t>
-      </w:r>
-      <w:r>
-        <w:rPr>
-          <w:rFonts w:ascii="Arial" w:eastAsia="Arial" w:hAnsi="Arial" w:cs="Arial"/>
-          <w:color w:val="808080"/>
-          <w:sz w:val="28"/>
-          <w:szCs w:val="28"/>
-        </w:rPr>
-        <w:t xml:space="preserve"> ao mínimo existencial;</w:t>
       </w:r>
       <w:r>
         <w:rPr>
@@ -5393,11 +5907,19 @@
       <w:r>
         <w:rPr>
           <w:rFonts w:ascii="Arial" w:eastAsia="Arial" w:hAnsi="Arial" w:cs="Arial"/>
-          <w:color w:val="808080"/>
-          <w:sz w:val="28"/>
-          <w:szCs w:val="28"/>
-        </w:rPr>
-        <w:t xml:space="preserve">a</w:t>
+          <w:sz w:val="28"/>
+          <w:szCs w:val="28"/>
+        </w:rPr>
+        <w:t xml:space="preserve">a </w:t>
+      </w:r>
+      <w:r>
+        <w:rPr>
+          <w:rFonts w:ascii="Arial" w:eastAsia="Arial" w:hAnsi="Arial" w:cs="Arial"/>
+          <w:color w:val="808080"/>
+          <w:sz w:val="28"/>
+          <w:szCs w:val="28"/>
+        </w:rPr>
+        <w:t xml:space="preserve">privação</w:t>
       </w:r>
       <w:r>
         <w:rPr>
@@ -5414,49 +5936,7 @@
           <w:sz w:val="28"/>
           <w:szCs w:val="28"/>
         </w:rPr>
-        <w:t xml:space="preserve">autorização contratual para débitos em conta não legitima</w:t>
-      </w:r>
-      <w:r>
-        <w:rPr>
-          <w:rFonts w:ascii="Arial" w:eastAsia="Arial" w:hAnsi="Arial" w:cs="Arial"/>
-          <w:sz w:val="28"/>
-          <w:szCs w:val="28"/>
-        </w:rPr>
-        <w:t xml:space="preserve"> a reten</w:t>
-      </w:r>
-      <w:r>
-        <w:rPr>
-          <w:rFonts w:ascii="Arial" w:eastAsia="Arial" w:hAnsi="Arial" w:cs="Arial"/>
-          <w:sz w:val="28"/>
-          <w:szCs w:val="28"/>
-        </w:rPr>
-        <w:t xml:space="preserve">ção integral de </w:t>
-      </w:r>
-      <w:r>
-        <w:rPr>
-          <w:rFonts w:ascii="Arial" w:eastAsia="Arial" w:hAnsi="Arial" w:cs="Arial"/>
-          <w:color w:val="808080"/>
-          <w:sz w:val="28"/>
-          <w:szCs w:val="28"/>
-        </w:rPr>
-        <w:t xml:space="preserve">verbas</w:t>
-      </w:r>
-      <w:r>
-        <w:rPr>
-          <w:rFonts w:ascii="Arial" w:eastAsia="Arial" w:hAnsi="Arial" w:cs="Arial"/>
-          <w:sz w:val="28"/>
-          <w:szCs w:val="28"/>
-        </w:rPr>
-        <w:t xml:space="preserve"> salariais</w:t>
-      </w:r>
-      <w:r>
-        <w:rPr>
-          <w:rFonts w:ascii="Arial" w:eastAsia="Arial" w:hAnsi="Arial" w:cs="Arial"/>
-          <w:color w:val="808080"/>
-          <w:sz w:val="28"/>
-          <w:szCs w:val="28"/>
-        </w:rPr>
-        <w:t xml:space="preserve">;</w:t>
+        <w:t xml:space="preserve">reiterada</w:t>
       </w:r>
       <w:r>
         <w:rPr>
@@ -5473,6 +5953,40 @@
           <w:sz w:val="28"/>
           <w:szCs w:val="28"/>
         </w:rPr>
+        <w:t xml:space="preserve">da</w:t>
+      </w:r>
+      <w:r>
+        <w:rPr>
+          <w:rFonts w:ascii="Arial" w:eastAsia="Arial" w:hAnsi="Arial" w:cs="Arial"/>
+          <w:sz w:val="28"/>
+          <w:szCs w:val="28"/>
+        </w:rPr>
+        <w:t xml:space="preserve"> </w:t>
+      </w:r>
+      <w:r>
+        <w:rPr>
+          <w:rFonts w:ascii="Arial" w:eastAsia="Arial" w:hAnsi="Arial" w:cs="Arial"/>
+          <w:color w:val="808080"/>
+          <w:sz w:val="28"/>
+          <w:szCs w:val="28"/>
+        </w:rPr>
+        <w:t xml:space="preserve">remuneração</w:t>
+      </w:r>
+      <w:r>
+        <w:rPr>
+          <w:rFonts w:ascii="Arial" w:eastAsia="Arial" w:hAnsi="Arial" w:cs="Arial"/>
+          <w:sz w:val="28"/>
+          <w:szCs w:val="28"/>
+        </w:rPr>
+        <w:t xml:space="preserve"> </w:t>
+      </w:r>
+      <w:r>
+        <w:rPr>
+          <w:rFonts w:ascii="Arial" w:eastAsia="Arial" w:hAnsi="Arial" w:cs="Arial"/>
+          <w:color w:val="808080"/>
+          <w:sz w:val="28"/>
+          <w:szCs w:val="28"/>
+        </w:rPr>
         <w:t xml:space="preserve">e</w:t>
       </w:r>
       <w:r>
@@ -5486,29 +6000,19 @@
       <w:r>
         <w:rPr>
           <w:rFonts w:ascii="Arial" w:eastAsia="Arial" w:hAnsi="Arial" w:cs="Arial"/>
-          <w:b/>
-          <w:color w:val="808080"/>
-          <w:sz w:val="28"/>
-          <w:szCs w:val="28"/>
-        </w:rPr>
-        <w:t xml:space="preserve">4)</w:t>
-      </w:r>
-      <w:r>
-        <w:rPr>
-          <w:rFonts w:ascii="Arial" w:eastAsia="Arial" w:hAnsi="Arial" w:cs="Arial"/>
-          <w:color w:val="808080"/>
-          <w:sz w:val="28"/>
-          <w:szCs w:val="28"/>
-        </w:rPr>
-        <w:t xml:space="preserve"> a privação reiterada da remuneração e a manutenção</w:t>
-      </w:r>
-      <w:r>
-        <w:rPr>
-          <w:rFonts w:ascii="Arial" w:eastAsia="Arial" w:hAnsi="Arial" w:cs="Arial"/>
-          <w:sz w:val="28"/>
-          <w:szCs w:val="28"/>
-        </w:rPr>
-        <w:t xml:space="preserve"> de </w:t>
+          <w:color w:val="808080"/>
+          <w:sz w:val="28"/>
+          <w:szCs w:val="28"/>
+        </w:rPr>
+        <w:t xml:space="preserve">o</w:t>
+      </w:r>
+      <w:r>
+        <w:rPr>
+          <w:rFonts w:ascii="Arial" w:eastAsia="Arial" w:hAnsi="Arial" w:cs="Arial"/>
+          <w:sz w:val="28"/>
+          <w:szCs w:val="28"/>
+        </w:rPr>
+        <w:t xml:space="preserve"> </w:t>
       </w:r>
       <w:r>
         <w:rPr>
@@ -5586,23 +6090,6 @@
           <w:szCs w:val="28"/>
         </w:rPr>
         <w:t xml:space="preserve">moral</w:t>
-      </w:r>
-      <w:r>
-        <w:rPr>
-          <w:rFonts w:ascii="Arial" w:eastAsia="Arial" w:hAnsi="Arial" w:cs="Arial"/>
-          <w:sz w:val="28"/>
-          <w:szCs w:val="28"/>
-        </w:rPr>
-        <w:t xml:space="preserve"> </w:t>
-      </w:r>
-      <w:r>
-        <w:rPr>
-          <w:rFonts w:ascii="Arial" w:eastAsia="Arial" w:hAnsi="Arial" w:cs="Arial"/>
-          <w:color w:val="808080"/>
-          <w:sz w:val="28"/>
-          <w:szCs w:val="28"/>
-        </w:rPr>
-        <w:t xml:space="preserve">indenizável</w:t>
       </w:r>
       <w:r>
         <w:rPr>
@@ -5713,7 +6200,7 @@
           <w:sz w:val="28"/>
           <w:szCs w:val="28"/>
         </w:rPr>
-        <w:t xml:space="preserve">O c. STJ, no julgamento do Tema Repetitivo 1.085, fixou a seguinte tese:</w:t>
+        <w:t xml:space="preserve">O c. STJ fixou, no Tema 1.085, a seguinte tese:</w:t>
       </w:r>
     </w:p>
     <w:p>
@@ -5774,67 +6261,544 @@
         <w:spacing w:after="0" w:line="360" w:lineRule="auto"/>
         <w:ind w:firstLine="2268"/>
         <w:jc w:val="both"/>
-        <w:rPr/>
+        <w:rPr>
+          <w:rFonts w:ascii="Arial" w:eastAsia="Arial" w:hAnsi="Arial" w:cs="Arial"/>
+          <w:sz w:val="28"/>
+          <w:szCs w:val="28"/>
+        </w:rPr>
       </w:pPr>
       <w:commentRangeStart w:id="14"/>
       <w:r>
         <w:rPr>
           <w:rFonts w:ascii="Arial" w:eastAsia="Arial" w:hAnsi="Arial" w:cs="Arial"/>
-          <w:color w:val="808080"/>
-          <w:sz w:val="28"/>
-          <w:szCs w:val="28"/>
-        </w:rPr>
-        <w:t xml:space="preserve">Os</w:t>
-      </w:r>
-      <w:r>
-        <w:rPr>
-          <w:rFonts w:ascii="Arial" w:eastAsia="Arial" w:hAnsi="Arial" w:cs="Arial"/>
-          <w:sz w:val="28"/>
-          <w:szCs w:val="28"/>
-        </w:rPr>
-        <w:t xml:space="preserve"> descontos questionados decorreram de operações de crédito </w:t>
-      </w:r>
-      <w:r>
-        <w:rPr>
-          <w:rFonts w:ascii="Arial" w:eastAsia="Arial" w:hAnsi="Arial" w:cs="Arial"/>
-          <w:sz w:val="28"/>
-          <w:szCs w:val="28"/>
-        </w:rPr>
-        <w:t xml:space="preserve">contratadas pela </w:t>
-      </w:r>
-      <w:r>
-        <w:rPr>
-          <w:rFonts w:ascii="Arial" w:eastAsia="Arial" w:hAnsi="Arial" w:cs="Arial"/>
-          <w:color w:val="808080"/>
-          <w:sz w:val="28"/>
-          <w:szCs w:val="28"/>
-        </w:rPr>
-        <w:t xml:space="preserve">autora</w:t>
-      </w:r>
-      <w:r>
-        <w:rPr>
-          <w:rFonts w:ascii="Arial" w:eastAsia="Arial" w:hAnsi="Arial" w:cs="Arial"/>
-          <w:sz w:val="28"/>
-          <w:szCs w:val="28"/>
-        </w:rPr>
-        <w:t xml:space="preserve">, </w:t>
-      </w:r>
-      <w:r>
-        <w:rPr>
-          <w:rFonts w:ascii="Arial" w:eastAsia="Arial" w:hAnsi="Arial" w:cs="Arial"/>
-          <w:color w:val="808080"/>
-          <w:sz w:val="28"/>
-          <w:szCs w:val="28"/>
-        </w:rPr>
-        <w:t xml:space="preserve">com</w:t>
-      </w:r>
-      <w:r>
-        <w:rPr>
-          <w:rFonts w:ascii="Arial" w:eastAsia="Arial" w:hAnsi="Arial" w:cs="Arial"/>
-          <w:sz w:val="28"/>
-          <w:szCs w:val="28"/>
-        </w:rPr>
-        <w:t xml:space="preserve"> autorização expressa para o provisionamento e o débito de valores em conta</w:t>
+          <w:sz w:val="28"/>
+          <w:szCs w:val="28"/>
+        </w:rPr>
+        <w:t xml:space="preserve">Os contratos </w:t>
+      </w:r>
+      <w:r>
+        <w:rPr>
+          <w:rFonts w:ascii="Arial" w:eastAsia="Arial" w:hAnsi="Arial" w:cs="Arial"/>
+          <w:color w:val="808080"/>
+          <w:sz w:val="28"/>
+          <w:szCs w:val="28"/>
+        </w:rPr>
+        <w:t xml:space="preserve">trazem</w:t>
+      </w:r>
+      <w:r>
+        <w:rPr>
+          <w:rFonts w:ascii="Arial" w:eastAsia="Arial" w:hAnsi="Arial" w:cs="Arial"/>
+          <w:sz w:val="28"/>
+          <w:szCs w:val="28"/>
+        </w:rPr>
+        <w:t xml:space="preserve"> </w:t>
+      </w:r>
+      <w:r>
+        <w:rPr>
+          <w:rFonts w:ascii="Arial" w:eastAsia="Arial" w:hAnsi="Arial" w:cs="Arial"/>
+          <w:color w:val="808080"/>
+          <w:sz w:val="28"/>
+          <w:szCs w:val="28"/>
+        </w:rPr>
+        <w:t xml:space="preserve">a</w:t>
+      </w:r>
+      <w:r>
+        <w:rPr>
+          <w:rFonts w:ascii="Arial" w:eastAsia="Arial" w:hAnsi="Arial" w:cs="Arial"/>
+          <w:sz w:val="28"/>
+          <w:szCs w:val="28"/>
+        </w:rPr>
+        <w:t xml:space="preserve"> </w:t>
+      </w:r>
+      <w:r>
+        <w:rPr>
+          <w:rFonts w:ascii="Arial" w:eastAsia="Arial" w:hAnsi="Arial" w:cs="Arial"/>
+          <w:color w:val="808080"/>
+          <w:sz w:val="28"/>
+          <w:szCs w:val="28"/>
+        </w:rPr>
+        <w:t xml:space="preserve">mesma</w:t>
+      </w:r>
+      <w:r>
+        <w:rPr>
+          <w:rFonts w:ascii="Arial" w:eastAsia="Arial" w:hAnsi="Arial" w:cs="Arial"/>
+          <w:sz w:val="28"/>
+          <w:szCs w:val="28"/>
+        </w:rPr>
+        <w:t xml:space="preserve"> </w:t>
+      </w:r>
+      <w:r>
+        <w:rPr>
+          <w:rFonts w:ascii="Arial" w:eastAsia="Arial" w:hAnsi="Arial" w:cs="Arial"/>
+          <w:color w:val="808080"/>
+          <w:sz w:val="28"/>
+          <w:szCs w:val="28"/>
+        </w:rPr>
+        <w:t xml:space="preserve">cláusula</w:t>
+      </w:r>
+      <w:r>
+        <w:rPr>
+          <w:rFonts w:ascii="Arial" w:eastAsia="Arial" w:hAnsi="Arial" w:cs="Arial"/>
+          <w:sz w:val="28"/>
+          <w:szCs w:val="28"/>
+        </w:rPr>
+        <w:t xml:space="preserve"> de </w:t>
+      </w:r>
+      <w:r>
+        <w:rPr>
+          <w:rFonts w:ascii="Arial" w:eastAsia="Arial" w:hAnsi="Arial" w:cs="Arial"/>
+          <w:color w:val="808080"/>
+          <w:sz w:val="28"/>
+          <w:szCs w:val="28"/>
+        </w:rPr>
+        <w:t xml:space="preserve">autorização</w:t>
+      </w:r>
+      <w:r>
+        <w:rPr>
+          <w:rFonts w:ascii="Arial" w:eastAsia="Arial" w:hAnsi="Arial" w:cs="Arial"/>
+          <w:sz w:val="28"/>
+          <w:szCs w:val="28"/>
+        </w:rPr>
+        <w:t xml:space="preserve"> </w:t>
+      </w:r>
+      <w:r>
+        <w:rPr>
+          <w:rFonts w:ascii="Arial" w:eastAsia="Arial" w:hAnsi="Arial" w:cs="Arial"/>
+          <w:color w:val="808080"/>
+          <w:sz w:val="28"/>
+          <w:szCs w:val="28"/>
+        </w:rPr>
+        <w:t xml:space="preserve">de</w:t>
+      </w:r>
+      <w:r>
+        <w:rPr>
+          <w:rFonts w:ascii="Arial" w:eastAsia="Arial" w:hAnsi="Arial" w:cs="Arial"/>
+          <w:sz w:val="28"/>
+          <w:szCs w:val="28"/>
+        </w:rPr>
+        <w:t xml:space="preserve"> </w:t>
+      </w:r>
+      <w:r>
+        <w:rPr>
+          <w:rFonts w:ascii="Arial" w:eastAsia="Arial" w:hAnsi="Arial" w:cs="Arial"/>
+          <w:color w:val="808080"/>
+          <w:sz w:val="28"/>
+          <w:szCs w:val="28"/>
+        </w:rPr>
+        <w:t xml:space="preserve">débito,</w:t>
+      </w:r>
+      <w:r>
+        <w:rPr>
+          <w:rFonts w:ascii="Arial" w:eastAsia="Arial" w:hAnsi="Arial" w:cs="Arial"/>
+          <w:sz w:val="28"/>
+          <w:szCs w:val="28"/>
+        </w:rPr>
+        <w:t xml:space="preserve"> </w:t>
+      </w:r>
+      <w:r>
+        <w:rPr>
+          <w:rFonts w:ascii="Arial" w:eastAsia="Arial" w:hAnsi="Arial" w:cs="Arial"/>
+          <w:color w:val="808080"/>
+          <w:sz w:val="28"/>
+          <w:szCs w:val="28"/>
+        </w:rPr>
+        <w:t xml:space="preserve">assim</w:t>
+      </w:r>
+      <w:r>
+        <w:rPr>
+          <w:rFonts w:ascii="Arial" w:eastAsia="Arial" w:hAnsi="Arial" w:cs="Arial"/>
+          <w:sz w:val="28"/>
+          <w:szCs w:val="28"/>
+        </w:rPr>
+        <w:t xml:space="preserve"> </w:t>
+      </w:r>
+      <w:r>
+        <w:rPr>
+          <w:rFonts w:ascii="Arial" w:eastAsia="Arial" w:hAnsi="Arial" w:cs="Arial"/>
+          <w:color w:val="808080"/>
+          <w:sz w:val="28"/>
+          <w:szCs w:val="28"/>
+        </w:rPr>
+        <w:t xml:space="preserve">redigida (ID</w:t>
+      </w:r>
+      <w:r>
+        <w:rPr>
+          <w:rFonts w:ascii="Arial" w:eastAsia="Arial" w:hAnsi="Arial" w:cs="Arial"/>
+          <w:sz w:val="28"/>
+          <w:szCs w:val="28"/>
+        </w:rPr>
+        <w:t xml:space="preserve"> 88901966, </w:t>
+      </w:r>
+      <w:r>
+        <w:rPr>
+          <w:rFonts w:ascii="Arial" w:eastAsia="Arial" w:hAnsi="Arial" w:cs="Arial"/>
+          <w:color w:val="808080"/>
+          <w:sz w:val="28"/>
+          <w:szCs w:val="28"/>
+        </w:rPr>
+        <w:t xml:space="preserve">88901967, 88901969</w:t>
+      </w:r>
+      <w:r>
+        <w:rPr>
+          <w:rFonts w:ascii="Arial" w:eastAsia="Arial" w:hAnsi="Arial" w:cs="Arial"/>
+          <w:sz w:val="28"/>
+          <w:szCs w:val="28"/>
+        </w:rPr>
+        <w:t xml:space="preserve"> e</w:t>
+      </w:r>
+      <w:r>
+        <w:rPr>
+          <w:rFonts w:ascii="Arial" w:eastAsia="Arial" w:hAnsi="Arial" w:cs="Arial"/>
+          <w:sz w:val="28"/>
+          <w:szCs w:val="28"/>
+        </w:rPr>
+        <w:t xml:space="preserve"> 88901970</w:t>
+      </w:r>
+      <w:r>
+        <w:rPr>
+          <w:rFonts w:ascii="Arial" w:eastAsia="Arial" w:hAnsi="Arial" w:cs="Arial"/>
+          <w:color w:val="808080"/>
+          <w:sz w:val="28"/>
+          <w:szCs w:val="28"/>
+        </w:rPr>
+        <w:t xml:space="preserve">):</w:t>
+      </w:r>
+      <w:commentRangeEnd w:id="14"/>
+      <w:r>
+        <w:rPr>
+          <w:rStyle w:val="CommentReference"/>
+        </w:rPr>
+        <w:commentReference w:id="14"/>
+      </w:r>
+    </w:p>
+    <w:p>
+      <w:pPr>
+        <w:spacing w:after="0" w:line="360" w:lineRule="auto"/>
+        <w:ind w:firstLine="2268"/>
+        <w:jc w:val="both"/>
+        <w:rPr>
+          <w:rFonts w:ascii="Arial" w:eastAsia="Arial" w:hAnsi="Arial" w:cs="Arial"/>
+          <w:sz w:val="28"/>
+          <w:szCs w:val="28"/>
+        </w:rPr>
+      </w:pPr>
+    </w:p>
+    <w:p>
+      <w:pPr>
+        <w:spacing w:after="0" w:line="360" w:lineRule="auto"/>
+        <w:ind w:left="2268" w:firstLine="3402"/>
+        <w:jc w:val="both"/>
+        <w:rPr>
+          <w:rFonts w:ascii="Arial" w:eastAsia="Arial" w:hAnsi="Arial" w:cs="Arial"/>
+          <w:sz w:val="28"/>
+          <w:szCs w:val="28"/>
+        </w:rPr>
+      </w:pPr>
+      <w:r>
+        <w:rPr>
+          <w:rFonts w:ascii="Arial" w:eastAsia="Arial" w:hAnsi="Arial" w:cs="Arial"/>
+          <w:i/>
+          <w:color w:val="808080"/>
+          <w:sz w:val="26"/>
+          <w:szCs w:val="28"/>
+        </w:rPr>
+        <w:t xml:space="preserve">“AUTORIZAÇÃO DE DÉBITOS - Você autoriza o BRB a provisionar e/ou debitar na conta corrente, poupança ou salário os valores referentes à liquidação, prestações, encargos financeiros e acessórios do empréstimo concedido a você (...). </w:t>
+      </w:r>
+      <w:r>
+        <w:rPr>
+          <w:rFonts w:ascii="Arial" w:eastAsia="Arial" w:hAnsi="Arial" w:cs="Arial"/>
+          <w:i/>
+          <w:color w:val="808080"/>
+          <w:sz w:val="26"/>
+          <w:szCs w:val="28"/>
+          <w:u w:val="single"/>
+        </w:rPr>
+        <w:t xml:space="preserve">Essa autorização tem validade até a liquidação total da operação</w:t>
+      </w:r>
+      <w:r>
+        <w:rPr>
+          <w:rFonts w:ascii="Arial" w:eastAsia="Arial" w:hAnsi="Arial" w:cs="Arial"/>
+          <w:i/>
+          <w:color w:val="808080"/>
+          <w:sz w:val="26"/>
+          <w:szCs w:val="28"/>
+        </w:rPr>
+        <w:t xml:space="preserve">.” – Grifei</w:t>
+      </w:r>
+    </w:p>
+    <w:p>
+      <w:pPr>
+        <w:spacing w:after="0" w:line="360" w:lineRule="auto"/>
+        <w:ind w:firstLine="2268"/>
+        <w:jc w:val="both"/>
+        <w:rPr>
+          <w:rFonts w:ascii="Arial" w:eastAsia="Arial" w:hAnsi="Arial" w:cs="Arial"/>
+          <w:sz w:val="28"/>
+          <w:szCs w:val="28"/>
+        </w:rPr>
+      </w:pPr>
+    </w:p>
+    <w:p>
+      <w:pPr>
+        <w:spacing w:after="0" w:line="360" w:lineRule="auto"/>
+        <w:ind w:firstLine="2268"/>
+        <w:jc w:val="both"/>
+      </w:pPr>
+      <w:commentRangeStart w:id="15"/>
+      <w:r>
+        <w:rPr>
+          <w:rFonts w:ascii="Arial" w:eastAsia="Arial" w:hAnsi="Arial" w:cs="Arial"/>
+          <w:color w:val="808080"/>
+          <w:sz w:val="28"/>
+          <w:szCs w:val="28"/>
+        </w:rPr>
+        <w:t xml:space="preserve">A</w:t>
+      </w:r>
+      <w:r>
+        <w:rPr>
+          <w:rFonts w:ascii="Arial" w:eastAsia="Arial" w:hAnsi="Arial" w:cs="Arial"/>
+          <w:sz w:val="28"/>
+          <w:szCs w:val="28"/>
+        </w:rPr>
+        <w:t xml:space="preserve"> autora </w:t>
+      </w:r>
+      <w:r>
+        <w:rPr>
+          <w:rFonts w:ascii="Arial" w:eastAsia="Arial" w:hAnsi="Arial" w:cs="Arial"/>
+          <w:color w:val="808080"/>
+          <w:sz w:val="28"/>
+          <w:szCs w:val="28"/>
+        </w:rPr>
+        <w:t xml:space="preserve">só</w:t>
+      </w:r>
+      <w:r>
+        <w:rPr>
+          <w:rFonts w:ascii="Arial" w:eastAsia="Arial" w:hAnsi="Arial" w:cs="Arial"/>
+          <w:sz w:val="28"/>
+          <w:szCs w:val="28"/>
+        </w:rPr>
+        <w:t xml:space="preserve"> </w:t>
+      </w:r>
+      <w:r>
+        <w:rPr>
+          <w:rFonts w:ascii="Arial" w:eastAsia="Arial" w:hAnsi="Arial" w:cs="Arial"/>
+          <w:color w:val="808080"/>
+          <w:sz w:val="28"/>
+          <w:szCs w:val="28"/>
+        </w:rPr>
+        <w:t xml:space="preserve">pediu</w:t>
+      </w:r>
+      <w:r>
+        <w:rPr>
+          <w:rFonts w:ascii="Arial" w:eastAsia="Arial" w:hAnsi="Arial" w:cs="Arial"/>
+          <w:sz w:val="28"/>
+          <w:szCs w:val="28"/>
+        </w:rPr>
+        <w:t xml:space="preserve"> </w:t>
+      </w:r>
+      <w:r>
+        <w:rPr>
+          <w:rFonts w:ascii="Arial" w:eastAsia="Arial" w:hAnsi="Arial" w:cs="Arial"/>
+          <w:color w:val="808080"/>
+          <w:sz w:val="28"/>
+          <w:szCs w:val="28"/>
+        </w:rPr>
+        <w:t xml:space="preserve">o</w:t>
+      </w:r>
+      <w:r>
+        <w:rPr>
+          <w:rFonts w:ascii="Arial" w:eastAsia="Arial" w:hAnsi="Arial" w:cs="Arial"/>
+          <w:sz w:val="28"/>
+          <w:szCs w:val="28"/>
+        </w:rPr>
+        <w:t xml:space="preserve"> cancelamento da autorização</w:t>
+      </w:r>
+      <w:r>
+        <w:rPr>
+          <w:rFonts w:ascii="Arial" w:eastAsia="Arial" w:hAnsi="Arial" w:cs="Arial"/>
+          <w:sz w:val="28"/>
+          <w:szCs w:val="28"/>
+        </w:rPr>
+        <w:t xml:space="preserve"> em 16/4/2026, </w:t>
+      </w:r>
+      <w:r>
+        <w:rPr>
+          <w:rFonts w:ascii="Arial" w:eastAsia="Arial" w:hAnsi="Arial" w:cs="Arial"/>
+          <w:color w:val="808080"/>
+          <w:sz w:val="28"/>
+          <w:szCs w:val="28"/>
+        </w:rPr>
+        <w:t xml:space="preserve">e</w:t>
+      </w:r>
+      <w:r>
+        <w:rPr>
+          <w:rFonts w:ascii="Arial" w:eastAsia="Arial" w:hAnsi="Arial" w:cs="Arial"/>
+          <w:sz w:val="28"/>
+          <w:szCs w:val="28"/>
+        </w:rPr>
+        <w:t xml:space="preserve"> os descontos </w:t>
+      </w:r>
+      <w:r>
+        <w:rPr>
+          <w:rFonts w:ascii="Arial" w:eastAsia="Arial" w:hAnsi="Arial" w:cs="Arial"/>
+          <w:color w:val="808080"/>
+          <w:sz w:val="28"/>
+          <w:szCs w:val="28"/>
+        </w:rPr>
+        <w:t xml:space="preserve">de</w:t>
+      </w:r>
+      <w:r>
+        <w:rPr>
+          <w:rFonts w:ascii="Arial" w:eastAsia="Arial" w:hAnsi="Arial" w:cs="Arial"/>
+          <w:sz w:val="28"/>
+          <w:szCs w:val="28"/>
+        </w:rPr>
+        <w:t xml:space="preserve"> </w:t>
+      </w:r>
+      <w:r>
+        <w:rPr>
+          <w:rFonts w:ascii="Arial" w:eastAsia="Arial" w:hAnsi="Arial" w:cs="Arial"/>
+          <w:color w:val="808080"/>
+          <w:sz w:val="28"/>
+          <w:szCs w:val="28"/>
+        </w:rPr>
+        <w:t xml:space="preserve">novembro</w:t>
+      </w:r>
+      <w:r>
+        <w:rPr>
+          <w:rFonts w:ascii="Arial" w:eastAsia="Arial" w:hAnsi="Arial" w:cs="Arial"/>
+          <w:sz w:val="28"/>
+          <w:szCs w:val="28"/>
+        </w:rPr>
+        <w:t xml:space="preserve"> </w:t>
+      </w:r>
+      <w:r>
+        <w:rPr>
+          <w:rFonts w:ascii="Arial" w:eastAsia="Arial" w:hAnsi="Arial" w:cs="Arial"/>
+          <w:color w:val="808080"/>
+          <w:sz w:val="28"/>
+          <w:szCs w:val="28"/>
+        </w:rPr>
+        <w:t xml:space="preserve">de</w:t>
+      </w:r>
+      <w:r>
+        <w:rPr>
+          <w:rFonts w:ascii="Arial" w:eastAsia="Arial" w:hAnsi="Arial" w:cs="Arial"/>
+          <w:sz w:val="28"/>
+          <w:szCs w:val="28"/>
+        </w:rPr>
+        <w:t xml:space="preserve"> </w:t>
+      </w:r>
+      <w:r>
+        <w:rPr>
+          <w:rFonts w:ascii="Arial" w:eastAsia="Arial" w:hAnsi="Arial" w:cs="Arial"/>
+          <w:color w:val="808080"/>
+          <w:sz w:val="28"/>
+          <w:szCs w:val="28"/>
+        </w:rPr>
+        <w:t xml:space="preserve">2025</w:t>
+      </w:r>
+      <w:r>
+        <w:rPr>
+          <w:rFonts w:ascii="Arial" w:eastAsia="Arial" w:hAnsi="Arial" w:cs="Arial"/>
+          <w:sz w:val="28"/>
+          <w:szCs w:val="28"/>
+        </w:rPr>
+        <w:t xml:space="preserve"> a </w:t>
+      </w:r>
+      <w:r>
+        <w:rPr>
+          <w:rFonts w:ascii="Arial" w:eastAsia="Arial" w:hAnsi="Arial" w:cs="Arial"/>
+          <w:color w:val="808080"/>
+          <w:sz w:val="28"/>
+          <w:szCs w:val="28"/>
+        </w:rPr>
+        <w:t xml:space="preserve">abril</w:t>
+      </w:r>
+      <w:r>
+        <w:rPr>
+          <w:rFonts w:ascii="Arial" w:eastAsia="Arial" w:hAnsi="Arial" w:cs="Arial"/>
+          <w:sz w:val="28"/>
+          <w:szCs w:val="28"/>
+        </w:rPr>
+        <w:t xml:space="preserve"> </w:t>
+      </w:r>
+      <w:r>
+        <w:rPr>
+          <w:rFonts w:ascii="Arial" w:eastAsia="Arial" w:hAnsi="Arial" w:cs="Arial"/>
+          <w:color w:val="808080"/>
+          <w:sz w:val="28"/>
+          <w:szCs w:val="28"/>
+        </w:rPr>
+        <w:t xml:space="preserve">de</w:t>
+      </w:r>
+      <w:r>
+        <w:rPr>
+          <w:rFonts w:ascii="Arial" w:eastAsia="Arial" w:hAnsi="Arial" w:cs="Arial"/>
+          <w:sz w:val="28"/>
+          <w:szCs w:val="28"/>
+        </w:rPr>
+        <w:t xml:space="preserve"> </w:t>
+      </w:r>
+      <w:r>
+        <w:rPr>
+          <w:rFonts w:ascii="Arial" w:eastAsia="Arial" w:hAnsi="Arial" w:cs="Arial"/>
+          <w:color w:val="808080"/>
+          <w:sz w:val="28"/>
+          <w:szCs w:val="28"/>
+        </w:rPr>
+        <w:t xml:space="preserve">2026</w:t>
+      </w:r>
+      <w:r>
+        <w:rPr>
+          <w:rFonts w:ascii="Arial" w:eastAsia="Arial" w:hAnsi="Arial" w:cs="Arial"/>
+          <w:sz w:val="28"/>
+          <w:szCs w:val="28"/>
+        </w:rPr>
+        <w:t xml:space="preserve"> </w:t>
+      </w:r>
+      <w:r>
+        <w:rPr>
+          <w:rFonts w:ascii="Arial" w:eastAsia="Arial" w:hAnsi="Arial" w:cs="Arial"/>
+          <w:color w:val="808080"/>
+          <w:sz w:val="28"/>
+          <w:szCs w:val="28"/>
+        </w:rPr>
+        <w:t xml:space="preserve">a</w:t>
+      </w:r>
+      <w:r>
+        <w:rPr>
+          <w:rFonts w:ascii="Arial" w:eastAsia="Arial" w:hAnsi="Arial" w:cs="Arial"/>
+          <w:sz w:val="28"/>
+          <w:szCs w:val="28"/>
+        </w:rPr>
+        <w:t xml:space="preserve"> </w:t>
+      </w:r>
+      <w:r>
+        <w:rPr>
+          <w:rFonts w:ascii="Arial" w:eastAsia="Arial" w:hAnsi="Arial" w:cs="Arial"/>
+          <w:color w:val="808080"/>
+          <w:sz w:val="28"/>
+          <w:szCs w:val="28"/>
+        </w:rPr>
+        <w:t xml:space="preserve">precederam</w:t>
+      </w:r>
+      <w:r>
+        <w:rPr>
+          <w:rFonts w:ascii="Arial" w:eastAsia="Arial" w:hAnsi="Arial" w:cs="Arial"/>
+          <w:sz w:val="28"/>
+          <w:szCs w:val="28"/>
+        </w:rPr>
+        <w:t xml:space="preserve"> </w:t>
+      </w:r>
+      <w:r>
+        <w:rPr>
+          <w:rFonts w:ascii="Arial" w:eastAsia="Arial" w:hAnsi="Arial" w:cs="Arial"/>
+          <w:color w:val="808080"/>
+          <w:sz w:val="28"/>
+          <w:szCs w:val="28"/>
+        </w:rPr>
+        <w:t xml:space="preserve">(ID 88901975)</w:t>
       </w:r>
       <w:r>
         <w:rPr>
@@ -5844,6 +6808,25 @@
         </w:rPr>
         <w:t xml:space="preserve">.</w:t>
       </w:r>
+      <w:commentRangeEnd w:id="15"/>
+      <w:r>
+        <w:rPr>
+          <w:rStyle w:val="CommentReference"/>
+        </w:rPr>
+        <w:commentReference w:id="15"/>
+      </w:r>
+    </w:p>
+    <w:p>
+      <w:pPr>
+        <w:spacing w:after="0" w:line="360" w:lineRule="auto"/>
+        <w:ind w:firstLine="2268"/>
+        <w:jc w:val="both"/>
+        <w:rPr>
+          <w:rFonts w:ascii="Arial" w:eastAsia="Arial" w:hAnsi="Arial" w:cs="Arial"/>
+          <w:sz w:val="28"/>
+          <w:szCs w:val="28"/>
+        </w:rPr>
+      </w:pPr>
     </w:p>
     <w:p>
       <w:pPr>
@@ -5852,47 +6835,51 @@
         <w:jc w:val="both"/>
         <w:rPr/>
       </w:pPr>
-    </w:p>
-    <w:p>
-      <w:pPr>
-        <w:spacing w:after="0" w:line="360" w:lineRule="auto"/>
-        <w:ind w:firstLine="2268"/>
-        <w:jc w:val="both"/>
-        <w:rPr>
-          <w:rFonts w:ascii="Arial" w:eastAsia="Arial" w:hAnsi="Arial" w:cs="Arial"/>
-          <w:sz w:val="28"/>
-          <w:szCs w:val="28"/>
-        </w:rPr>
-      </w:pPr>
-      <w:r>
-        <w:rPr>
-          <w:rFonts w:ascii="Arial" w:eastAsia="Arial" w:hAnsi="Arial" w:cs="Arial"/>
-          <w:sz w:val="28"/>
-          <w:szCs w:val="28"/>
-        </w:rPr>
-        <w:t xml:space="preserve">Os contratos de crédito pessoal e de empréstimo consignado </w:t>
-      </w:r>
-      <w:r>
-        <w:rPr>
-          <w:rFonts w:ascii="Arial" w:eastAsia="Arial" w:hAnsi="Arial" w:cs="Arial"/>
-          <w:sz w:val="28"/>
-          <w:szCs w:val="28"/>
-        </w:rPr>
-        <w:t xml:space="preserve">contêm cláusula</w:t>
-      </w:r>
-      <w:r>
-        <w:rPr>
-          <w:rFonts w:ascii="Arial" w:eastAsia="Arial" w:hAnsi="Arial" w:cs="Arial"/>
-          <w:sz w:val="28"/>
-          <w:szCs w:val="28"/>
-        </w:rPr>
-        <w:t xml:space="preserve">s</w:t>
-      </w:r>
-      <w:r>
-        <w:rPr>
-          <w:rFonts w:ascii="Arial" w:eastAsia="Arial" w:hAnsi="Arial" w:cs="Arial"/>
-          <w:sz w:val="28"/>
-          <w:szCs w:val="28"/>
+      <w:commentRangeStart w:id="21"/>
+      <w:r>
+        <w:rPr>
+          <w:rFonts w:ascii="Arial" w:eastAsia="Arial" w:hAnsi="Arial" w:cs="Arial"/>
+          <w:color w:val="808080"/>
+          <w:sz w:val="28"/>
+          <w:szCs w:val="28"/>
+          <w:highlight w:val="yellow"/>
+        </w:rPr>
+        <w:t xml:space="preserve">Assim, a</w:t>
+      </w:r>
+      <w:r>
+        <w:rPr>
+          <w:rFonts w:ascii="Arial" w:eastAsia="Arial" w:hAnsi="Arial" w:cs="Arial"/>
+          <w:sz w:val="28"/>
+          <w:szCs w:val="28"/>
+          <w:highlight w:val="yellow"/>
+        </w:rPr>
+        <w:t xml:space="preserve"> hipótese </w:t>
+      </w:r>
+      <w:r>
+        <w:rPr>
+          <w:rFonts w:ascii="Arial" w:eastAsia="Arial" w:hAnsi="Arial" w:cs="Arial"/>
+          <w:sz w:val="28"/>
+          <w:szCs w:val="28"/>
+          <w:highlight w:val="yellow"/>
+        </w:rPr>
+        <w:t xml:space="preserve">se </w:t>
+      </w:r>
+      <w:r>
+        <w:rPr>
+          <w:rFonts w:ascii="Arial" w:eastAsia="Arial" w:hAnsi="Arial" w:cs="Arial"/>
+          <w:color w:val="808080"/>
+          <w:sz w:val="28"/>
+          <w:szCs w:val="28"/>
+          <w:highlight w:val="yellow"/>
+        </w:rPr>
+        <w:t xml:space="preserve">amolda</w:t>
+      </w:r>
+      <w:r>
+        <w:rPr>
+          <w:rFonts w:ascii="Arial" w:eastAsia="Arial" w:hAnsi="Arial" w:cs="Arial"/>
+          <w:sz w:val="28"/>
+          <w:szCs w:val="28"/>
+          <w:highlight w:val="yellow"/>
         </w:rPr>
         <w:t xml:space="preserve"> </w:t>
       </w:r>
@@ -5902,14 +6889,35 @@
           <w:color w:val="808080"/>
           <w:sz w:val="28"/>
           <w:szCs w:val="28"/>
-        </w:rPr>
-        <w:t xml:space="preserve">que</w:t>
-      </w:r>
-      <w:r>
-        <w:rPr>
-          <w:rFonts w:ascii="Arial" w:eastAsia="Arial" w:hAnsi="Arial" w:cs="Arial"/>
-          <w:sz w:val="28"/>
-          <w:szCs w:val="28"/>
+          <w:highlight w:val="yellow"/>
+        </w:rPr>
+        <w:t xml:space="preserve">ao</w:t>
+      </w:r>
+      <w:r>
+        <w:rPr>
+          <w:rFonts w:ascii="Arial" w:eastAsia="Arial" w:hAnsi="Arial" w:cs="Arial"/>
+          <w:sz w:val="28"/>
+          <w:szCs w:val="28"/>
+          <w:highlight w:val="yellow"/>
+        </w:rPr>
+        <w:t xml:space="preserve"> Tema 1.085, </w:t>
+      </w:r>
+      <w:r>
+        <w:rPr>
+          <w:rFonts w:ascii="Arial" w:eastAsia="Arial" w:hAnsi="Arial" w:cs="Arial"/>
+          <w:color w:val="808080"/>
+          <w:sz w:val="28"/>
+          <w:szCs w:val="28"/>
+          <w:highlight w:val="yellow"/>
+        </w:rPr>
+        <w:t xml:space="preserve">e</w:t>
+      </w:r>
+      <w:r>
+        <w:rPr>
+          <w:rFonts w:ascii="Arial" w:eastAsia="Arial" w:hAnsi="Arial" w:cs="Arial"/>
+          <w:sz w:val="28"/>
+          <w:szCs w:val="28"/>
+          <w:highlight w:val="yellow"/>
         </w:rPr>
         <w:t xml:space="preserve"> </w:t>
       </w:r>
@@ -5919,14 +6927,16 @@
           <w:color w:val="808080"/>
           <w:sz w:val="28"/>
           <w:szCs w:val="28"/>
-        </w:rPr>
-        <w:t xml:space="preserve">autorizam</w:t>
-      </w:r>
-      <w:r>
-        <w:rPr>
-          <w:rFonts w:ascii="Arial" w:eastAsia="Arial" w:hAnsi="Arial" w:cs="Arial"/>
-          <w:sz w:val="28"/>
-          <w:szCs w:val="28"/>
+          <w:highlight w:val="yellow"/>
+        </w:rPr>
+        <w:t xml:space="preserve">o</w:t>
+      </w:r>
+      <w:r>
+        <w:rPr>
+          <w:rFonts w:ascii="Arial" w:eastAsia="Arial" w:hAnsi="Arial" w:cs="Arial"/>
+          <w:sz w:val="28"/>
+          <w:szCs w:val="28"/>
+          <w:highlight w:val="yellow"/>
         </w:rPr>
         <w:t xml:space="preserve"> </w:t>
       </w:r>
@@ -5936,14 +6946,16 @@
           <w:color w:val="808080"/>
           <w:sz w:val="28"/>
           <w:szCs w:val="28"/>
-        </w:rPr>
-        <w:t xml:space="preserve">o</w:t>
-      </w:r>
-      <w:r>
-        <w:rPr>
-          <w:rFonts w:ascii="Arial" w:eastAsia="Arial" w:hAnsi="Arial" w:cs="Arial"/>
-          <w:sz w:val="28"/>
-          <w:szCs w:val="28"/>
+          <w:highlight w:val="yellow"/>
+        </w:rPr>
+        <w:t xml:space="preserve">banco</w:t>
+      </w:r>
+      <w:r>
+        <w:rPr>
+          <w:rFonts w:ascii="Arial" w:eastAsia="Arial" w:hAnsi="Arial" w:cs="Arial"/>
+          <w:sz w:val="28"/>
+          <w:szCs w:val="28"/>
+          <w:highlight w:val="yellow"/>
         </w:rPr>
         <w:t xml:space="preserve"> </w:t>
       </w:r>
@@ -5953,95 +6965,35 @@
           <w:color w:val="808080"/>
           <w:sz w:val="28"/>
           <w:szCs w:val="28"/>
-        </w:rPr>
-        <w:t xml:space="preserve">banco</w:t>
-      </w:r>
-      <w:r>
-        <w:rPr>
-          <w:rFonts w:ascii="Arial" w:eastAsia="Arial" w:hAnsi="Arial" w:cs="Arial"/>
-          <w:sz w:val="28"/>
-          <w:szCs w:val="28"/>
-        </w:rPr>
-        <w:t xml:space="preserve"> a provisionar </w:t>
-      </w:r>
-      <w:r>
-        <w:rPr>
-          <w:rFonts w:ascii="Arial" w:eastAsia="Arial" w:hAnsi="Arial" w:cs="Arial"/>
-          <w:sz w:val="28"/>
-          <w:szCs w:val="28"/>
-        </w:rPr>
-        <w:t xml:space="preserve">ou debitar valores em conta corrente, conta-salário ou poupança para </w:t>
-      </w:r>
-      <w:r>
-        <w:rPr>
-          <w:rFonts w:ascii="Arial" w:eastAsia="Arial" w:hAnsi="Arial" w:cs="Arial"/>
-          <w:color w:val="808080"/>
-          <w:sz w:val="28"/>
-          <w:szCs w:val="28"/>
-        </w:rPr>
-        <w:t xml:space="preserve">a </w:t>
-      </w:r>
-      <w:r>
-        <w:rPr>
-          <w:rFonts w:ascii="Arial" w:eastAsia="Arial" w:hAnsi="Arial" w:cs="Arial"/>
-          <w:sz w:val="28"/>
-          <w:szCs w:val="28"/>
-        </w:rPr>
-        <w:t xml:space="preserve">liquidação das obrigações assumidas </w:t>
-      </w:r>
-      <w:r>
-        <w:rPr>
-          <w:rFonts w:ascii="Arial" w:eastAsia="Arial" w:hAnsi="Arial" w:cs="Arial"/>
-          <w:color w:val="808080"/>
-          <w:sz w:val="28"/>
-          <w:szCs w:val="28"/>
-        </w:rPr>
-        <w:t xml:space="preserve">(ID</w:t>
-      </w:r>
-      <w:r>
-        <w:rPr>
-          <w:rFonts w:ascii="Arial" w:eastAsia="Arial" w:hAnsi="Arial" w:cs="Arial"/>
-          <w:sz w:val="28"/>
-          <w:szCs w:val="28"/>
-        </w:rPr>
-        <w:t xml:space="preserve"> </w:t>
-      </w:r>
-      <w:r>
-        <w:rPr>
-          <w:rFonts w:ascii="Arial" w:eastAsia="Arial" w:hAnsi="Arial" w:cs="Arial"/>
-          <w:color w:val="808080"/>
-          <w:sz w:val="28"/>
-          <w:szCs w:val="28"/>
-        </w:rPr>
-        <w:t xml:space="preserve">88901966, 88901968 e 88901970)</w:t>
-      </w:r>
-      <w:r>
-        <w:rPr>
-          <w:rFonts w:ascii="Arial" w:eastAsia="Arial" w:hAnsi="Arial" w:cs="Arial"/>
-          <w:sz w:val="28"/>
-          <w:szCs w:val="28"/>
+          <w:highlight w:val="yellow"/>
+        </w:rPr>
+        <w:t xml:space="preserve">agiu</w:t>
+      </w:r>
+      <w:r>
+        <w:rPr>
+          <w:rFonts w:ascii="Arial" w:eastAsia="Arial" w:hAnsi="Arial" w:cs="Arial"/>
+          <w:sz w:val="28"/>
+          <w:szCs w:val="28"/>
+          <w:highlight w:val="yellow"/>
+        </w:rPr>
+        <w:t xml:space="preserve"> no exercício regular de direito</w:t>
+      </w:r>
+      <w:r>
+        <w:rPr>
+          <w:rFonts w:ascii="Arial" w:eastAsia="Arial" w:hAnsi="Arial" w:cs="Arial"/>
+          <w:sz w:val="28"/>
+          <w:szCs w:val="28"/>
+          <w:highlight w:val="yellow"/>
         </w:rPr>
         <w:t xml:space="preserve">.</w:t>
       </w:r>
-      <w:commentRangeEnd w:id="14"/>
+      <w:commentRangeEnd w:id="21"/>
       <w:r>
         <w:rPr>
           <w:rStyle w:val="CommentReference"/>
         </w:rPr>
-        <w:commentReference w:id="14"/>
-      </w:r>
-    </w:p>
-    <w:p>
-      <w:pPr>
-        <w:spacing w:after="0" w:line="360" w:lineRule="auto"/>
-        <w:ind w:firstLine="2268"/>
-        <w:jc w:val="both"/>
-        <w:rPr>
-          <w:rFonts w:ascii="Arial" w:eastAsia="Arial" w:hAnsi="Arial" w:cs="Arial"/>
-          <w:sz w:val="28"/>
-          <w:szCs w:val="28"/>
-        </w:rPr>
-      </w:pPr>
+        <w:commentReference w:id="21"/>
+      </w:r>
     </w:p>
     <w:p>
       <w:pPr>
@@ -6050,935 +7002,6 @@
         <w:jc w:val="both"/>
         <w:rPr/>
       </w:pPr>
-      <w:r>
-        <w:rPr>
-          <w:rFonts w:ascii="Arial" w:eastAsia="Arial" w:hAnsi="Arial" w:cs="Arial"/>
-          <w:color w:val="808080"/>
-          <w:sz w:val="28"/>
-          <w:szCs w:val="28"/>
-        </w:rPr>
-        <w:t xml:space="preserve">Assim</w:t>
-      </w:r>
-      <w:r>
-        <w:rPr>
-          <w:rFonts w:ascii="Arial" w:eastAsia="Arial" w:hAnsi="Arial" w:cs="Arial"/>
-          <w:sz w:val="28"/>
-          <w:szCs w:val="28"/>
-        </w:rPr>
-        <w:t xml:space="preserve">, não prospera a alegação de que a sentença </w:t>
-      </w:r>
-      <w:r>
-        <w:rPr>
-          <w:rFonts w:ascii="Arial" w:eastAsia="Arial" w:hAnsi="Arial" w:cs="Arial"/>
-          <w:color w:val="808080"/>
-          <w:sz w:val="28"/>
-          <w:szCs w:val="28"/>
-        </w:rPr>
-        <w:t xml:space="preserve">aplicou</w:t>
-      </w:r>
-      <w:r>
-        <w:rPr>
-          <w:rFonts w:ascii="Arial" w:eastAsia="Arial" w:hAnsi="Arial" w:cs="Arial"/>
-          <w:sz w:val="28"/>
-          <w:szCs w:val="28"/>
-        </w:rPr>
-        <w:t xml:space="preserve"> o Tema 1.085</w:t>
-      </w:r>
-      <w:r>
-        <w:rPr>
-          <w:rFonts w:ascii="Arial" w:eastAsia="Arial" w:hAnsi="Arial" w:cs="Arial"/>
-          <w:sz w:val="28"/>
-          <w:szCs w:val="28"/>
-        </w:rPr>
-        <w:t xml:space="preserve"> sem examinar a origem dos lançamentos.</w:t>
-      </w:r>
-    </w:p>
-    <w:p>
-      <w:pPr>
-        <w:spacing w:after="0" w:line="360" w:lineRule="auto"/>
-        <w:ind w:firstLine="2268"/>
-        <w:jc w:val="both"/>
-        <w:rPr/>
-      </w:pPr>
-    </w:p>
-    <w:p>
-      <w:pPr>
-        <w:spacing w:after="0" w:line="360" w:lineRule="auto"/>
-        <w:ind w:firstLine="2268"/>
-        <w:jc w:val="both"/>
-      </w:pPr>
-      <w:r>
-        <w:rPr>
-          <w:rFonts w:ascii="Arial" w:eastAsia="Arial" w:hAnsi="Arial" w:cs="Arial"/>
-          <w:color w:val="808080"/>
-          <w:sz w:val="28"/>
-          <w:szCs w:val="28"/>
-        </w:rPr>
-        <w:t xml:space="preserve">Os</w:t>
-      </w:r>
-      <w:r>
-        <w:rPr>
-          <w:rFonts w:ascii="Arial" w:eastAsia="Arial" w:hAnsi="Arial" w:cs="Arial"/>
-          <w:sz w:val="28"/>
-          <w:szCs w:val="28"/>
-        </w:rPr>
-        <w:t xml:space="preserve"> documentos apresentados pelo banco demonstram que os débitos </w:t>
-      </w:r>
-      <w:r>
-        <w:rPr>
-          <w:rFonts w:ascii="Arial" w:eastAsia="Arial" w:hAnsi="Arial" w:cs="Arial"/>
-          <w:color w:val="808080"/>
-          <w:sz w:val="28"/>
-          <w:szCs w:val="28"/>
-        </w:rPr>
-        <w:t xml:space="preserve">têm</w:t>
-      </w:r>
-      <w:r>
-        <w:rPr>
-          <w:rFonts w:ascii="Arial" w:eastAsia="Arial" w:hAnsi="Arial" w:cs="Arial"/>
-          <w:sz w:val="28"/>
-          <w:szCs w:val="28"/>
-        </w:rPr>
-        <w:t xml:space="preserve"> fundamento contratual e decorrem de obrigações </w:t>
-      </w:r>
-      <w:r>
-        <w:rPr>
-          <w:rFonts w:ascii="Arial" w:eastAsia="Arial" w:hAnsi="Arial" w:cs="Arial"/>
-          <w:sz w:val="28"/>
-          <w:szCs w:val="28"/>
-        </w:rPr>
-        <w:t xml:space="preserve">assumidas pela própria autora</w:t>
-      </w:r>
-      <w:r>
-        <w:rPr>
-          <w:rFonts w:ascii="Arial" w:eastAsia="Arial" w:hAnsi="Arial" w:cs="Arial"/>
-          <w:color w:val="808080"/>
-          <w:sz w:val="28"/>
-          <w:szCs w:val="28"/>
-        </w:rPr>
-        <w:t xml:space="preserve">,</w:t>
-      </w:r>
-      <w:r>
-        <w:rPr>
-          <w:rFonts w:ascii="Arial" w:eastAsia="Arial" w:hAnsi="Arial" w:cs="Arial"/>
-          <w:sz w:val="28"/>
-          <w:szCs w:val="28"/>
-        </w:rPr>
-        <w:t xml:space="preserve"> </w:t>
-      </w:r>
-      <w:r>
-        <w:rPr>
-          <w:rFonts w:ascii="Arial" w:eastAsia="Arial" w:hAnsi="Arial" w:cs="Arial"/>
-          <w:color w:val="808080"/>
-          <w:sz w:val="28"/>
-          <w:szCs w:val="28"/>
-        </w:rPr>
-        <w:t xml:space="preserve">o</w:t>
-      </w:r>
-      <w:r>
-        <w:rPr>
-          <w:rFonts w:ascii="Arial" w:eastAsia="Arial" w:hAnsi="Arial" w:cs="Arial"/>
-          <w:sz w:val="28"/>
-          <w:szCs w:val="28"/>
-        </w:rPr>
-        <w:t xml:space="preserve"> </w:t>
-      </w:r>
-      <w:r>
-        <w:rPr>
-          <w:rFonts w:ascii="Arial" w:eastAsia="Arial" w:hAnsi="Arial" w:cs="Arial"/>
-          <w:color w:val="808080"/>
-          <w:sz w:val="28"/>
-          <w:szCs w:val="28"/>
-        </w:rPr>
-        <w:t xml:space="preserve">que</w:t>
-      </w:r>
-      <w:r>
-        <w:rPr>
-          <w:rFonts w:ascii="Arial" w:eastAsia="Arial" w:hAnsi="Arial" w:cs="Arial"/>
-          <w:sz w:val="28"/>
-          <w:szCs w:val="28"/>
-        </w:rPr>
-        <w:t xml:space="preserve"> afasta a alegação de</w:t>
-      </w:r>
-      <w:r>
-        <w:rPr>
-          <w:rFonts w:ascii="Arial" w:eastAsia="Arial" w:hAnsi="Arial" w:cs="Arial"/>
-          <w:sz w:val="28"/>
-          <w:szCs w:val="28"/>
-        </w:rPr>
-        <w:t xml:space="preserve"> cobrança não individualizada</w:t>
-      </w:r>
-      <w:r>
-        <w:rPr>
-          <w:rFonts w:ascii="Arial" w:eastAsia="Arial" w:hAnsi="Arial" w:cs="Arial"/>
-          <w:sz w:val="28"/>
-          <w:szCs w:val="28"/>
-        </w:rPr>
-        <w:t xml:space="preserve"> ou </w:t>
-      </w:r>
-      <w:r>
-        <w:rPr>
-          <w:rFonts w:ascii="Arial" w:eastAsia="Arial" w:hAnsi="Arial" w:cs="Arial"/>
-          <w:color w:val="808080"/>
-          <w:sz w:val="28"/>
-          <w:szCs w:val="28"/>
-        </w:rPr>
-        <w:t xml:space="preserve">sem</w:t>
-      </w:r>
-      <w:r>
-        <w:rPr>
-          <w:rFonts w:ascii="Arial" w:eastAsia="Arial" w:hAnsi="Arial" w:cs="Arial"/>
-          <w:sz w:val="28"/>
-          <w:szCs w:val="28"/>
-        </w:rPr>
-        <w:t xml:space="preserve"> lastro jurídico.</w:t>
-      </w:r>
-    </w:p>
-    <w:p>
-      <w:pPr>
-        <w:spacing w:after="0" w:line="360" w:lineRule="auto"/>
-        <w:ind w:firstLine="2268"/>
-        <w:jc w:val="both"/>
-        <w:rPr>
-          <w:rFonts w:ascii="Arial" w:eastAsia="Arial" w:hAnsi="Arial" w:cs="Arial"/>
-          <w:sz w:val="28"/>
-          <w:szCs w:val="28"/>
-        </w:rPr>
-      </w:pPr>
-    </w:p>
-    <w:p>
-      <w:pPr>
-        <w:spacing w:after="0" w:line="360" w:lineRule="auto"/>
-        <w:ind w:firstLine="2268"/>
-        <w:jc w:val="both"/>
-        <w:rPr/>
-      </w:pPr>
-      <w:commentRangeStart w:id="15"/>
-      <w:r>
-        <w:rPr>
-          <w:rFonts w:ascii="Arial" w:eastAsia="Arial" w:hAnsi="Arial" w:cs="Arial"/>
-          <w:color w:val="808080"/>
-          <w:sz w:val="28"/>
-          <w:szCs w:val="28"/>
-        </w:rPr>
-        <w:t xml:space="preserve">A</w:t>
-      </w:r>
-      <w:r>
-        <w:rPr>
-          <w:rFonts w:ascii="Arial" w:eastAsia="Arial" w:hAnsi="Arial" w:cs="Arial"/>
-          <w:sz w:val="28"/>
-          <w:szCs w:val="28"/>
-        </w:rPr>
-        <w:t xml:space="preserve"> </w:t>
-      </w:r>
-      <w:r>
-        <w:rPr>
-          <w:rFonts w:ascii="Arial" w:eastAsia="Arial" w:hAnsi="Arial" w:cs="Arial"/>
-          <w:color w:val="808080"/>
-          <w:sz w:val="28"/>
-          <w:szCs w:val="28"/>
-        </w:rPr>
-        <w:t xml:space="preserve">r. sentença consignou</w:t>
-      </w:r>
-      <w:r>
-        <w:rPr>
-          <w:rFonts w:ascii="Arial" w:eastAsia="Arial" w:hAnsi="Arial" w:cs="Arial"/>
-          <w:sz w:val="28"/>
-          <w:szCs w:val="28"/>
-        </w:rPr>
-        <w:t xml:space="preserve">, a </w:t>
-      </w:r>
-      <w:r>
-        <w:rPr>
-          <w:rFonts w:ascii="Arial" w:eastAsia="Arial" w:hAnsi="Arial" w:cs="Arial"/>
-          <w:color w:val="808080"/>
-          <w:sz w:val="28"/>
-          <w:szCs w:val="28"/>
-        </w:rPr>
-        <w:t xml:space="preserve">partir</w:t>
-      </w:r>
-      <w:r>
-        <w:rPr>
-          <w:rFonts w:ascii="Arial" w:eastAsia="Arial" w:hAnsi="Arial" w:cs="Arial"/>
-          <w:sz w:val="28"/>
-          <w:szCs w:val="28"/>
-        </w:rPr>
-        <w:t xml:space="preserve"> do processo conexo nº 0709997-65.2026.8.07.0007</w:t>
-      </w:r>
-      <w:r>
-        <w:rPr>
-          <w:rFonts w:ascii="Arial" w:eastAsia="Arial" w:hAnsi="Arial" w:cs="Arial"/>
-          <w:sz w:val="28"/>
-          <w:szCs w:val="28"/>
-        </w:rPr>
-        <w:t xml:space="preserve">, </w:t>
-      </w:r>
-      <w:r>
-        <w:rPr>
-          <w:rFonts w:ascii="Arial" w:eastAsia="Arial" w:hAnsi="Arial" w:cs="Arial"/>
-          <w:color w:val="808080"/>
-          <w:sz w:val="28"/>
-          <w:szCs w:val="28"/>
-        </w:rPr>
-        <w:t xml:space="preserve">que a autora só pediu o cancelamento da autorização de débito em 16/4/2026 (ID 88901975).</w:t>
-      </w:r>
-    </w:p>
-    <w:p>
-      <w:pPr>
-        <w:spacing w:after="0" w:line="360" w:lineRule="auto"/>
-        <w:ind w:firstLine="2268"/>
-        <w:jc w:val="both"/>
-        <w:rPr/>
-      </w:pPr>
-    </w:p>
-    <w:p>
-      <w:pPr>
-        <w:spacing w:after="0" w:line="360" w:lineRule="auto"/>
-        <w:ind w:firstLine="2268"/>
-        <w:jc w:val="both"/>
-      </w:pPr>
-      <w:r>
-        <w:rPr>
-          <w:rFonts w:ascii="Arial" w:eastAsia="Arial" w:hAnsi="Arial" w:cs="Arial"/>
-          <w:color w:val="808080"/>
-          <w:sz w:val="28"/>
-          <w:szCs w:val="28"/>
-        </w:rPr>
-        <w:t xml:space="preserve">Os</w:t>
-      </w:r>
-      <w:r>
-        <w:rPr>
-          <w:rFonts w:ascii="Arial" w:eastAsia="Arial" w:hAnsi="Arial" w:cs="Arial"/>
-          <w:sz w:val="28"/>
-          <w:szCs w:val="28"/>
-        </w:rPr>
-        <w:t xml:space="preserve"> descontos discutidos</w:t>
-      </w:r>
-      <w:r>
-        <w:rPr>
-          <w:rFonts w:ascii="Arial" w:eastAsia="Arial" w:hAnsi="Arial" w:cs="Arial"/>
-          <w:color w:val="808080"/>
-          <w:sz w:val="28"/>
-          <w:szCs w:val="28"/>
-        </w:rPr>
-        <w:t xml:space="preserve">,</w:t>
-      </w:r>
-      <w:r>
-        <w:rPr>
-          <w:rFonts w:ascii="Arial" w:eastAsia="Arial" w:hAnsi="Arial" w:cs="Arial"/>
-          <w:sz w:val="28"/>
-          <w:szCs w:val="28"/>
-        </w:rPr>
-        <w:t xml:space="preserve"> </w:t>
-      </w:r>
-      <w:r>
-        <w:rPr>
-          <w:rFonts w:ascii="Arial" w:eastAsia="Arial" w:hAnsi="Arial" w:cs="Arial"/>
-          <w:color w:val="808080"/>
-          <w:sz w:val="28"/>
-          <w:szCs w:val="28"/>
-        </w:rPr>
-        <w:t xml:space="preserve">de</w:t>
-      </w:r>
-      <w:r>
-        <w:rPr>
-          <w:rFonts w:ascii="Arial" w:eastAsia="Arial" w:hAnsi="Arial" w:cs="Arial"/>
-          <w:sz w:val="28"/>
-          <w:szCs w:val="28"/>
-        </w:rPr>
-        <w:t xml:space="preserve"> </w:t>
-      </w:r>
-      <w:r>
-        <w:rPr>
-          <w:rFonts w:ascii="Arial" w:eastAsia="Arial" w:hAnsi="Arial" w:cs="Arial"/>
-          <w:color w:val="808080"/>
-          <w:sz w:val="28"/>
-          <w:szCs w:val="28"/>
-        </w:rPr>
-        <w:t xml:space="preserve">novembro</w:t>
-      </w:r>
-      <w:r>
-        <w:rPr>
-          <w:rFonts w:ascii="Arial" w:eastAsia="Arial" w:hAnsi="Arial" w:cs="Arial"/>
-          <w:sz w:val="28"/>
-          <w:szCs w:val="28"/>
-        </w:rPr>
-        <w:t xml:space="preserve"> </w:t>
-      </w:r>
-      <w:r>
-        <w:rPr>
-          <w:rFonts w:ascii="Arial" w:eastAsia="Arial" w:hAnsi="Arial" w:cs="Arial"/>
-          <w:color w:val="808080"/>
-          <w:sz w:val="28"/>
-          <w:szCs w:val="28"/>
-        </w:rPr>
-        <w:t xml:space="preserve">de</w:t>
-      </w:r>
-      <w:r>
-        <w:rPr>
-          <w:rFonts w:ascii="Arial" w:eastAsia="Arial" w:hAnsi="Arial" w:cs="Arial"/>
-          <w:sz w:val="28"/>
-          <w:szCs w:val="28"/>
-        </w:rPr>
-        <w:t xml:space="preserve"> </w:t>
-      </w:r>
-      <w:r>
-        <w:rPr>
-          <w:rFonts w:ascii="Arial" w:eastAsia="Arial" w:hAnsi="Arial" w:cs="Arial"/>
-          <w:color w:val="808080"/>
-          <w:sz w:val="28"/>
-          <w:szCs w:val="28"/>
-        </w:rPr>
-        <w:t xml:space="preserve">2025</w:t>
-      </w:r>
-      <w:r>
-        <w:rPr>
-          <w:rFonts w:ascii="Arial" w:eastAsia="Arial" w:hAnsi="Arial" w:cs="Arial"/>
-          <w:sz w:val="28"/>
-          <w:szCs w:val="28"/>
-        </w:rPr>
-        <w:t xml:space="preserve"> </w:t>
-      </w:r>
-      <w:r>
-        <w:rPr>
-          <w:rFonts w:ascii="Arial" w:eastAsia="Arial" w:hAnsi="Arial" w:cs="Arial"/>
-          <w:color w:val="808080"/>
-          <w:sz w:val="28"/>
-          <w:szCs w:val="28"/>
-        </w:rPr>
-        <w:t xml:space="preserve">a</w:t>
-      </w:r>
-      <w:r>
-        <w:rPr>
-          <w:rFonts w:ascii="Arial" w:eastAsia="Arial" w:hAnsi="Arial" w:cs="Arial"/>
-          <w:sz w:val="28"/>
-          <w:szCs w:val="28"/>
-        </w:rPr>
-        <w:t xml:space="preserve"> </w:t>
-      </w:r>
-      <w:r>
-        <w:rPr>
-          <w:rFonts w:ascii="Arial" w:eastAsia="Arial" w:hAnsi="Arial" w:cs="Arial"/>
-          <w:color w:val="808080"/>
-          <w:sz w:val="28"/>
-          <w:szCs w:val="28"/>
-        </w:rPr>
-        <w:t xml:space="preserve">abril</w:t>
-      </w:r>
-      <w:r>
-        <w:rPr>
-          <w:rFonts w:ascii="Arial" w:eastAsia="Arial" w:hAnsi="Arial" w:cs="Arial"/>
-          <w:sz w:val="28"/>
-          <w:szCs w:val="28"/>
-        </w:rPr>
-        <w:t xml:space="preserve"> </w:t>
-      </w:r>
-      <w:r>
-        <w:rPr>
-          <w:rFonts w:ascii="Arial" w:eastAsia="Arial" w:hAnsi="Arial" w:cs="Arial"/>
-          <w:color w:val="808080"/>
-          <w:sz w:val="28"/>
-          <w:szCs w:val="28"/>
-        </w:rPr>
-        <w:t xml:space="preserve">de 2026, ocorreram, portanto, com</w:t>
-      </w:r>
-      <w:r>
-        <w:rPr>
-          <w:rFonts w:ascii="Arial" w:eastAsia="Arial" w:hAnsi="Arial" w:cs="Arial"/>
-          <w:sz w:val="28"/>
-          <w:szCs w:val="28"/>
-        </w:rPr>
-        <w:t xml:space="preserve"> a autorização </w:t>
-      </w:r>
-      <w:r>
-        <w:rPr>
-          <w:rFonts w:ascii="Arial" w:eastAsia="Arial" w:hAnsi="Arial" w:cs="Arial"/>
-          <w:color w:val="808080"/>
-          <w:sz w:val="28"/>
-          <w:szCs w:val="28"/>
-        </w:rPr>
-        <w:t xml:space="preserve">contratual</w:t>
-      </w:r>
-      <w:r>
-        <w:rPr>
-          <w:rFonts w:ascii="Arial" w:eastAsia="Arial" w:hAnsi="Arial" w:cs="Arial"/>
-          <w:sz w:val="28"/>
-          <w:szCs w:val="28"/>
-        </w:rPr>
-        <w:t xml:space="preserve"> </w:t>
-      </w:r>
-      <w:r>
-        <w:rPr>
-          <w:rFonts w:ascii="Arial" w:eastAsia="Arial" w:hAnsi="Arial" w:cs="Arial"/>
-          <w:color w:val="808080"/>
-          <w:sz w:val="28"/>
-          <w:szCs w:val="28"/>
-        </w:rPr>
-        <w:t xml:space="preserve">ainda</w:t>
-      </w:r>
-      <w:r>
-        <w:rPr>
-          <w:rFonts w:ascii="Arial" w:eastAsia="Arial" w:hAnsi="Arial" w:cs="Arial"/>
-          <w:sz w:val="28"/>
-          <w:szCs w:val="28"/>
-        </w:rPr>
-        <w:t xml:space="preserve"> </w:t>
-      </w:r>
-      <w:r>
-        <w:rPr>
-          <w:rFonts w:ascii="Arial" w:eastAsia="Arial" w:hAnsi="Arial" w:cs="Arial"/>
-          <w:color w:val="808080"/>
-          <w:sz w:val="28"/>
-          <w:szCs w:val="28"/>
-        </w:rPr>
-        <w:t xml:space="preserve">vigente</w:t>
-      </w:r>
-      <w:r>
-        <w:rPr>
-          <w:rFonts w:ascii="Arial" w:eastAsia="Arial" w:hAnsi="Arial" w:cs="Arial"/>
-          <w:sz w:val="28"/>
-          <w:szCs w:val="28"/>
-        </w:rPr>
-        <w:t xml:space="preserve">.</w:t>
-      </w:r>
-      <w:commentRangeEnd w:id="15"/>
-      <w:r>
-        <w:rPr>
-          <w:rStyle w:val="CommentReference"/>
-        </w:rPr>
-        <w:commentReference w:id="15"/>
-      </w:r>
-    </w:p>
-    <w:p>
-      <w:pPr>
-        <w:spacing w:after="0" w:line="360" w:lineRule="auto"/>
-        <w:ind w:firstLine="2268"/>
-        <w:jc w:val="both"/>
-        <w:rPr>
-          <w:rFonts w:ascii="Arial" w:eastAsia="Arial" w:hAnsi="Arial" w:cs="Arial"/>
-          <w:sz w:val="28"/>
-          <w:szCs w:val="28"/>
-        </w:rPr>
-      </w:pPr>
-    </w:p>
-    <w:p>
-      <w:pPr>
-        <w:spacing w:after="0" w:line="360" w:lineRule="auto"/>
-        <w:ind w:firstLine="2268"/>
-        <w:jc w:val="both"/>
-        <w:rPr/>
-      </w:pPr>
-      <w:commentRangeStart w:id="21"/>
-      <w:r>
-        <w:rPr>
-          <w:rFonts w:ascii="Arial" w:eastAsia="Arial" w:hAnsi="Arial" w:cs="Arial"/>
-          <w:color w:val="808080"/>
-          <w:sz w:val="28"/>
-          <w:szCs w:val="28"/>
-        </w:rPr>
-        <w:t xml:space="preserve">O</w:t>
-      </w:r>
-      <w:r>
-        <w:rPr>
-          <w:rFonts w:ascii="Arial" w:eastAsia="Arial" w:hAnsi="Arial" w:cs="Arial"/>
-          <w:sz w:val="28"/>
-          <w:szCs w:val="28"/>
-        </w:rPr>
-        <w:t xml:space="preserve"> </w:t>
-      </w:r>
-      <w:r>
-        <w:rPr>
-          <w:rFonts w:ascii="Arial" w:eastAsia="Arial" w:hAnsi="Arial" w:cs="Arial"/>
-          <w:color w:val="808080"/>
-          <w:sz w:val="28"/>
-          <w:szCs w:val="28"/>
-        </w:rPr>
-        <w:t xml:space="preserve">caso se</w:t>
-      </w:r>
-      <w:r>
-        <w:rPr>
-          <w:rFonts w:ascii="Arial" w:eastAsia="Arial" w:hAnsi="Arial" w:cs="Arial"/>
-          <w:sz w:val="28"/>
-          <w:szCs w:val="28"/>
-        </w:rPr>
-        <w:t xml:space="preserve"> amolda</w:t>
-      </w:r>
-      <w:r>
-        <w:rPr>
-          <w:rFonts w:ascii="Arial" w:eastAsia="Arial" w:hAnsi="Arial" w:cs="Arial"/>
-          <w:sz w:val="28"/>
-          <w:szCs w:val="28"/>
-        </w:rPr>
-        <w:t xml:space="preserve"> à tese </w:t>
-      </w:r>
-      <w:r>
-        <w:rPr>
-          <w:rFonts w:ascii="Arial" w:eastAsia="Arial" w:hAnsi="Arial" w:cs="Arial"/>
-          <w:color w:val="808080"/>
-          <w:sz w:val="28"/>
-          <w:szCs w:val="28"/>
-        </w:rPr>
-        <w:t xml:space="preserve">do</w:t>
-      </w:r>
-      <w:r>
-        <w:rPr>
-          <w:rFonts w:ascii="Arial" w:eastAsia="Arial" w:hAnsi="Arial" w:cs="Arial"/>
-          <w:sz w:val="28"/>
-          <w:szCs w:val="28"/>
-        </w:rPr>
-        <w:t xml:space="preserve"> Tema 1.085, </w:t>
-      </w:r>
-      <w:r>
-        <w:rPr>
-          <w:rFonts w:ascii="Arial" w:eastAsia="Arial" w:hAnsi="Arial" w:cs="Arial"/>
-          <w:color w:val="808080"/>
-          <w:sz w:val="28"/>
-          <w:szCs w:val="28"/>
-        </w:rPr>
-        <w:t xml:space="preserve">pois</w:t>
-      </w:r>
-      <w:r>
-        <w:rPr>
-          <w:rFonts w:ascii="Arial" w:eastAsia="Arial" w:hAnsi="Arial" w:cs="Arial"/>
-          <w:sz w:val="28"/>
-          <w:szCs w:val="28"/>
-        </w:rPr>
-        <w:t xml:space="preserve"> </w:t>
-      </w:r>
-      <w:r>
-        <w:rPr>
-          <w:rFonts w:ascii="Arial" w:eastAsia="Arial" w:hAnsi="Arial" w:cs="Arial"/>
-          <w:sz w:val="28"/>
-          <w:szCs w:val="28"/>
-        </w:rPr>
-        <w:t xml:space="preserve">não </w:t>
-      </w:r>
-      <w:r>
-        <w:rPr>
-          <w:rFonts w:ascii="Arial" w:eastAsia="Arial" w:hAnsi="Arial" w:cs="Arial"/>
-          <w:color w:val="808080"/>
-          <w:sz w:val="28"/>
-          <w:szCs w:val="28"/>
-        </w:rPr>
-        <w:t xml:space="preserve">se demonstrou</w:t>
-      </w:r>
-      <w:r>
-        <w:rPr>
-          <w:rFonts w:ascii="Arial" w:eastAsia="Arial" w:hAnsi="Arial" w:cs="Arial"/>
-          <w:sz w:val="28"/>
-          <w:szCs w:val="28"/>
-        </w:rPr>
-        <w:t xml:space="preserve"> que os lançamentos </w:t>
-      </w:r>
-      <w:r>
-        <w:rPr>
-          <w:rFonts w:ascii="Arial" w:eastAsia="Arial" w:hAnsi="Arial" w:cs="Arial"/>
-          <w:color w:val="808080"/>
-          <w:sz w:val="28"/>
-          <w:szCs w:val="28"/>
-        </w:rPr>
-        <w:t xml:space="preserve">fossem</w:t>
-      </w:r>
-      <w:r>
-        <w:rPr>
-          <w:rFonts w:ascii="Arial" w:eastAsia="Arial" w:hAnsi="Arial" w:cs="Arial"/>
-          <w:sz w:val="28"/>
-          <w:szCs w:val="28"/>
-        </w:rPr>
-        <w:t xml:space="preserve"> estranhos às operações contratadas ou </w:t>
-      </w:r>
-      <w:r>
-        <w:rPr>
-          <w:rFonts w:ascii="Arial" w:eastAsia="Arial" w:hAnsi="Arial" w:cs="Arial"/>
-          <w:color w:val="808080"/>
-          <w:sz w:val="28"/>
-          <w:szCs w:val="28"/>
-        </w:rPr>
-        <w:t xml:space="preserve">contrários</w:t>
-      </w:r>
-      <w:r>
-        <w:rPr>
-          <w:rFonts w:ascii="Arial" w:eastAsia="Arial" w:hAnsi="Arial" w:cs="Arial"/>
-          <w:sz w:val="28"/>
-          <w:szCs w:val="28"/>
-        </w:rPr>
-        <w:t xml:space="preserve"> </w:t>
-      </w:r>
-      <w:r>
-        <w:rPr>
-          <w:rFonts w:ascii="Arial" w:eastAsia="Arial" w:hAnsi="Arial" w:cs="Arial"/>
-          <w:color w:val="808080"/>
-          <w:sz w:val="28"/>
-          <w:szCs w:val="28"/>
-        </w:rPr>
-        <w:t xml:space="preserve">às</w:t>
-      </w:r>
-      <w:r>
-        <w:rPr>
-          <w:rFonts w:ascii="Arial" w:eastAsia="Arial" w:hAnsi="Arial" w:cs="Arial"/>
-          <w:sz w:val="28"/>
-          <w:szCs w:val="28"/>
-        </w:rPr>
-        <w:t xml:space="preserve"> autorizações concedidas</w:t>
-      </w:r>
-      <w:r>
-        <w:rPr>
-          <w:rFonts w:ascii="Arial" w:eastAsia="Arial" w:hAnsi="Arial" w:cs="Arial"/>
-          <w:color w:val="808080"/>
-          <w:sz w:val="28"/>
-          <w:szCs w:val="28"/>
-        </w:rPr>
-        <w:t xml:space="preserve">.</w:t>
-      </w:r>
-    </w:p>
-    <w:p>
-      <w:pPr>
-        <w:spacing w:after="0" w:line="360" w:lineRule="auto"/>
-        <w:ind w:firstLine="2268"/>
-        <w:jc w:val="both"/>
-        <w:rPr/>
-      </w:pPr>
-    </w:p>
-    <w:p>
-      <w:pPr>
-        <w:spacing w:after="0" w:line="360" w:lineRule="auto"/>
-        <w:ind w:firstLine="2268"/>
-        <w:jc w:val="both"/>
-        <w:rPr/>
-      </w:pPr>
-      <w:r>
-        <w:rPr>
-          <w:rFonts w:ascii="Arial" w:eastAsia="Arial" w:hAnsi="Arial" w:cs="Arial"/>
-          <w:color w:val="808080"/>
-          <w:sz w:val="28"/>
-          <w:szCs w:val="28"/>
-          <w:highlight w:val="yellow"/>
-        </w:rPr>
-        <w:t xml:space="preserve">Logo</w:t>
-      </w:r>
-      <w:r>
-        <w:rPr>
-          <w:rFonts w:ascii="Arial" w:eastAsia="Arial" w:hAnsi="Arial" w:cs="Arial"/>
-          <w:sz w:val="28"/>
-          <w:szCs w:val="28"/>
-          <w:highlight w:val="yellow"/>
-        </w:rPr>
-        <w:t xml:space="preserve">, </w:t>
-      </w:r>
-      <w:r>
-        <w:rPr>
-          <w:rFonts w:ascii="Arial" w:eastAsia="Arial" w:hAnsi="Arial" w:cs="Arial"/>
-          <w:color w:val="808080"/>
-          <w:sz w:val="28"/>
-          <w:szCs w:val="28"/>
-          <w:highlight w:val="yellow"/>
-        </w:rPr>
-        <w:t xml:space="preserve">o</w:t>
-      </w:r>
-      <w:r>
-        <w:rPr>
-          <w:rFonts w:ascii="Arial" w:eastAsia="Arial" w:hAnsi="Arial" w:cs="Arial"/>
-          <w:sz w:val="28"/>
-          <w:szCs w:val="28"/>
-          <w:highlight w:val="yellow"/>
-        </w:rPr>
-        <w:t xml:space="preserve"> </w:t>
-      </w:r>
-      <w:r>
-        <w:rPr>
-          <w:rFonts w:ascii="Arial" w:eastAsia="Arial" w:hAnsi="Arial" w:cs="Arial"/>
-          <w:color w:val="808080"/>
-          <w:sz w:val="28"/>
-          <w:szCs w:val="28"/>
-          <w:highlight w:val="yellow"/>
-        </w:rPr>
-        <w:t xml:space="preserve">banco</w:t>
-      </w:r>
-      <w:r>
-        <w:rPr>
-          <w:rFonts w:ascii="Arial" w:eastAsia="Arial" w:hAnsi="Arial" w:cs="Arial"/>
-          <w:sz w:val="28"/>
-          <w:szCs w:val="28"/>
-          <w:highlight w:val="yellow"/>
-        </w:rPr>
-        <w:t xml:space="preserve"> </w:t>
-      </w:r>
-      <w:r>
-        <w:rPr>
-          <w:rFonts w:ascii="Arial" w:eastAsia="Arial" w:hAnsi="Arial" w:cs="Arial"/>
-          <w:color w:val="808080"/>
-          <w:sz w:val="28"/>
-          <w:szCs w:val="28"/>
-          <w:highlight w:val="yellow"/>
-        </w:rPr>
-        <w:t xml:space="preserve">agiu</w:t>
-      </w:r>
-      <w:r>
-        <w:rPr>
-          <w:rFonts w:ascii="Arial" w:eastAsia="Arial" w:hAnsi="Arial" w:cs="Arial"/>
-          <w:sz w:val="28"/>
-          <w:szCs w:val="28"/>
-          <w:highlight w:val="yellow"/>
-        </w:rPr>
-        <w:t xml:space="preserve"> no exercício regular de direito</w:t>
-      </w:r>
-      <w:r>
-        <w:rPr>
-          <w:rFonts w:ascii="Arial" w:eastAsia="Arial" w:hAnsi="Arial" w:cs="Arial"/>
-          <w:color w:val="808080"/>
-          <w:sz w:val="28"/>
-          <w:szCs w:val="28"/>
-          <w:highlight w:val="yellow"/>
-        </w:rPr>
-        <w:t xml:space="preserve">,</w:t>
-      </w:r>
-      <w:r>
-        <w:rPr>
-          <w:rFonts w:ascii="Arial" w:eastAsia="Arial" w:hAnsi="Arial" w:cs="Arial"/>
-          <w:sz w:val="28"/>
-          <w:szCs w:val="28"/>
-          <w:highlight w:val="yellow"/>
-        </w:rPr>
-        <w:t xml:space="preserve"> decorrente da execução </w:t>
-      </w:r>
-      <w:r>
-        <w:rPr>
-          <w:rFonts w:ascii="Arial" w:eastAsia="Arial" w:hAnsi="Arial" w:cs="Arial"/>
-          <w:color w:val="808080"/>
-          <w:sz w:val="28"/>
-          <w:szCs w:val="28"/>
-          <w:highlight w:val="yellow"/>
-        </w:rPr>
-        <w:t xml:space="preserve">dos</w:t>
-      </w:r>
-      <w:r>
-        <w:rPr>
-          <w:rFonts w:ascii="Arial" w:eastAsia="Arial" w:hAnsi="Arial" w:cs="Arial"/>
-          <w:sz w:val="28"/>
-          <w:szCs w:val="28"/>
-          <w:highlight w:val="yellow"/>
-        </w:rPr>
-        <w:t xml:space="preserve"> </w:t>
-      </w:r>
-      <w:r>
-        <w:rPr>
-          <w:rFonts w:ascii="Arial" w:eastAsia="Arial" w:hAnsi="Arial" w:cs="Arial"/>
-          <w:color w:val="808080"/>
-          <w:sz w:val="28"/>
-          <w:szCs w:val="28"/>
-          <w:highlight w:val="yellow"/>
-        </w:rPr>
-        <w:t xml:space="preserve">contratos</w:t>
-      </w:r>
-      <w:r>
-        <w:rPr>
-          <w:rFonts w:ascii="Arial" w:eastAsia="Arial" w:hAnsi="Arial" w:cs="Arial"/>
-          <w:sz w:val="28"/>
-          <w:szCs w:val="28"/>
-          <w:highlight w:val="yellow"/>
-        </w:rPr>
-        <w:t xml:space="preserve"> </w:t>
-      </w:r>
-      <w:r>
-        <w:rPr>
-          <w:rFonts w:ascii="Arial" w:eastAsia="Arial" w:hAnsi="Arial" w:cs="Arial"/>
-          <w:color w:val="808080"/>
-          <w:sz w:val="28"/>
-          <w:szCs w:val="28"/>
-          <w:highlight w:val="yellow"/>
-        </w:rPr>
-        <w:t xml:space="preserve">celebrados</w:t>
-      </w:r>
-      <w:r>
-        <w:rPr>
-          <w:rFonts w:ascii="Arial" w:eastAsia="Arial" w:hAnsi="Arial" w:cs="Arial"/>
-          <w:sz w:val="28"/>
-          <w:szCs w:val="28"/>
-          <w:highlight w:val="yellow"/>
-        </w:rPr>
-        <w:t xml:space="preserve"> </w:t>
-      </w:r>
-      <w:r>
-        <w:rPr>
-          <w:rFonts w:ascii="Arial" w:eastAsia="Arial" w:hAnsi="Arial" w:cs="Arial"/>
-          <w:color w:val="808080"/>
-          <w:sz w:val="28"/>
-          <w:szCs w:val="28"/>
-          <w:highlight w:val="yellow"/>
-        </w:rPr>
-        <w:t xml:space="preserve">entre</w:t>
-      </w:r>
-      <w:r>
-        <w:rPr>
-          <w:rFonts w:ascii="Arial" w:eastAsia="Arial" w:hAnsi="Arial" w:cs="Arial"/>
-          <w:sz w:val="28"/>
-          <w:szCs w:val="28"/>
-          <w:highlight w:val="yellow"/>
-        </w:rPr>
-        <w:t xml:space="preserve"> </w:t>
-      </w:r>
-      <w:r>
-        <w:rPr>
-          <w:rFonts w:ascii="Arial" w:eastAsia="Arial" w:hAnsi="Arial" w:cs="Arial"/>
-          <w:color w:val="808080"/>
-          <w:sz w:val="28"/>
-          <w:szCs w:val="28"/>
-          <w:highlight w:val="yellow"/>
-        </w:rPr>
-        <w:t xml:space="preserve">as</w:t>
-      </w:r>
-      <w:r>
-        <w:rPr>
-          <w:rFonts w:ascii="Arial" w:eastAsia="Arial" w:hAnsi="Arial" w:cs="Arial"/>
-          <w:sz w:val="28"/>
-          <w:szCs w:val="28"/>
-          <w:highlight w:val="yellow"/>
-        </w:rPr>
-        <w:t xml:space="preserve"> partes, </w:t>
-      </w:r>
-      <w:r>
-        <w:rPr>
-          <w:rFonts w:ascii="Arial" w:eastAsia="Arial" w:hAnsi="Arial" w:cs="Arial"/>
-          <w:color w:val="808080"/>
-          <w:sz w:val="28"/>
-          <w:szCs w:val="28"/>
-          <w:highlight w:val="yellow"/>
-        </w:rPr>
-        <w:t xml:space="preserve">sem praticar</w:t>
-      </w:r>
-      <w:r>
-        <w:rPr>
-          <w:rFonts w:ascii="Arial" w:eastAsia="Arial" w:hAnsi="Arial" w:cs="Arial"/>
-          <w:sz w:val="28"/>
-          <w:szCs w:val="28"/>
-          <w:highlight w:val="yellow"/>
-        </w:rPr>
-        <w:t xml:space="preserve"> ato ilícito</w:t>
-      </w:r>
-      <w:r>
-        <w:rPr>
-          <w:rFonts w:ascii="Arial" w:eastAsia="Arial" w:hAnsi="Arial" w:cs="Arial"/>
-          <w:sz w:val="28"/>
-          <w:szCs w:val="28"/>
-          <w:highlight w:val="yellow"/>
-        </w:rPr>
-        <w:t xml:space="preserve">.</w:t>
-      </w:r>
-      <w:commentRangeEnd w:id="21"/>
-      <w:r>
-        <w:rPr>
-          <w:rStyle w:val="CommentReference"/>
-        </w:rPr>
-        <w:commentReference w:id="21"/>
-      </w:r>
-    </w:p>
-    <w:p>
-      <w:pPr>
-        <w:spacing w:after="0" w:line="360" w:lineRule="auto"/>
-        <w:ind w:firstLine="2268"/>
-        <w:jc w:val="both"/>
-        <w:rPr/>
-      </w:pPr>
     </w:p>
     <w:p>
       <w:pPr>
@@ -6994,7 +7017,7 @@
           <w:sz w:val="28"/>
           <w:szCs w:val="28"/>
         </w:rPr>
-        <w:t xml:space="preserve">No ponto, adoto os fundamentos da r. sentença, que rebate pontualmente o argumento do mínimo existencial (ID 88901975):</w:t>
+        <w:t xml:space="preserve">No ponto, adoto os fundamentos da r. sentença (ID 88901975):</w:t>
       </w:r>
     </w:p>
     <w:p>
@@ -7035,7 +7058,7 @@
           <w:color w:val="808080"/>
           <w:sz w:val="26"/>
         </w:rPr>
-        <w:t xml:space="preserve">, notadamente por meio da ação de repactuação de dívidas prevista na Lei nº 14.181/2021, não se admitindo a transposição automática dessas categorias para a via indenizatória, transformando o exercício regular de direito contratual em ato ilícito gerador de dano moral.” – Grifei</w:t>
+        <w:t xml:space="preserve">, notadamente por meio da ação de repactuação de dívidas prevista na Lei nº 14.181/2021, não se admitindo a transposição automática dessas categorias para a via indenizatória (...).” – Grifei</w:t>
       </w:r>
     </w:p>
     <w:p>
@@ -7062,97 +7085,25 @@
           <w:color w:val="808080"/>
           <w:sz w:val="28"/>
           <w:szCs w:val="28"/>
-        </w:rPr>
-        <w:t xml:space="preserve">Como</w:t>
-      </w:r>
-      <w:r>
-        <w:rPr>
-          <w:rFonts w:ascii="Arial" w:eastAsia="Arial" w:hAnsi="Arial" w:cs="Arial"/>
-          <w:sz w:val="28"/>
-          <w:szCs w:val="28"/>
-        </w:rPr>
-        <w:t xml:space="preserve"> exposto, os descontos </w:t>
-      </w:r>
-      <w:r>
-        <w:rPr>
-          <w:rFonts w:ascii="Arial" w:eastAsia="Arial" w:hAnsi="Arial" w:cs="Arial"/>
-          <w:sz w:val="28"/>
-          <w:szCs w:val="28"/>
-        </w:rPr>
-        <w:t xml:space="preserve">decorreram do </w:t>
-      </w:r>
-      <w:r>
-        <w:rPr>
-          <w:rFonts w:ascii="Arial" w:eastAsia="Arial" w:hAnsi="Arial" w:cs="Arial"/>
-          <w:color w:val="808080"/>
-          <w:sz w:val="28"/>
-          <w:szCs w:val="28"/>
-        </w:rPr>
-        <w:t xml:space="preserve">exercício </w:t>
-      </w:r>
-      <w:r>
-        <w:rPr>
-          <w:rFonts w:ascii="Arial" w:eastAsia="Arial" w:hAnsi="Arial" w:cs="Arial"/>
-          <w:sz w:val="28"/>
-          <w:szCs w:val="28"/>
-        </w:rPr>
-        <w:t xml:space="preserve">regular</w:t>
-      </w:r>
-      <w:r>
-        <w:rPr>
-          <w:rFonts w:ascii="Arial" w:eastAsia="Arial" w:hAnsi="Arial" w:cs="Arial"/>
-          <w:sz w:val="28"/>
-          <w:szCs w:val="28"/>
-        </w:rPr>
-        <w:t xml:space="preserve"> de direito contratualmente previsto, </w:t>
-      </w:r>
-      <w:r>
-        <w:rPr>
-          <w:rFonts w:ascii="Arial" w:eastAsia="Arial" w:hAnsi="Arial" w:cs="Arial"/>
-          <w:color w:val="808080"/>
-          <w:sz w:val="28"/>
-          <w:szCs w:val="28"/>
-        </w:rPr>
-        <w:t xml:space="preserve">sem</w:t>
-      </w:r>
-      <w:r>
-        <w:rPr>
-          <w:rFonts w:ascii="Arial" w:eastAsia="Arial" w:hAnsi="Arial" w:cs="Arial"/>
-          <w:sz w:val="28"/>
-          <w:szCs w:val="28"/>
-        </w:rPr>
-        <w:t xml:space="preserve"> conduta ilícita </w:t>
-      </w:r>
-      <w:r>
-        <w:rPr>
-          <w:rFonts w:ascii="Arial" w:eastAsia="Arial" w:hAnsi="Arial" w:cs="Arial"/>
-          <w:color w:val="808080"/>
-          <w:sz w:val="28"/>
-          <w:szCs w:val="28"/>
-        </w:rPr>
-        <w:t xml:space="preserve">da</w:t>
-      </w:r>
-      <w:r>
-        <w:rPr>
-          <w:rFonts w:ascii="Arial" w:eastAsia="Arial" w:hAnsi="Arial" w:cs="Arial"/>
-          <w:sz w:val="28"/>
-          <w:szCs w:val="28"/>
-        </w:rPr>
-        <w:t xml:space="preserve"> instituição financeira</w:t>
-      </w:r>
-      <w:r>
-        <w:rPr>
-          <w:rFonts w:ascii="Arial" w:eastAsia="Arial" w:hAnsi="Arial" w:cs="Arial"/>
-          <w:sz w:val="28"/>
-          <w:szCs w:val="28"/>
-        </w:rPr>
-        <w:t xml:space="preserve">,</w:t>
-      </w:r>
-      <w:r>
-        <w:rPr>
-          <w:rFonts w:ascii="Arial" w:eastAsia="Arial" w:hAnsi="Arial" w:cs="Arial"/>
-          <w:sz w:val="28"/>
-          <w:szCs w:val="28"/>
+          <w:highlight w:val="yellow"/>
+        </w:rPr>
+        <w:t xml:space="preserve">Sem</w:t>
+      </w:r>
+      <w:r>
+        <w:rPr>
+          <w:rFonts w:ascii="Arial" w:eastAsia="Arial" w:hAnsi="Arial" w:cs="Arial"/>
+          <w:sz w:val="28"/>
+          <w:szCs w:val="28"/>
+          <w:highlight w:val="yellow"/>
+        </w:rPr>
+        <w:t xml:space="preserve"> ilicitude, não há</w:t>
+      </w:r>
+      <w:r>
+        <w:rPr>
+          <w:rFonts w:ascii="Arial" w:eastAsia="Arial" w:hAnsi="Arial" w:cs="Arial"/>
+          <w:sz w:val="28"/>
+          <w:szCs w:val="28"/>
+          <w:highlight w:val="yellow"/>
         </w:rPr>
         <w:t xml:space="preserve"> </w:t>
       </w:r>
@@ -7161,50 +7112,28 @@
           <w:rFonts w:ascii="Arial" w:eastAsia="Arial" w:hAnsi="Arial" w:cs="Arial"/>
           <w:sz w:val="28"/>
           <w:szCs w:val="28"/>
-        </w:rPr>
-        <w:t xml:space="preserve">o </w:t>
-      </w:r>
-      <w:r>
-        <w:rPr>
-          <w:rFonts w:ascii="Arial" w:eastAsia="Arial" w:hAnsi="Arial" w:cs="Arial"/>
-          <w:sz w:val="28"/>
-          <w:szCs w:val="28"/>
-        </w:rPr>
-        <w:t xml:space="preserve">que </w:t>
-      </w:r>
-      <w:r>
-        <w:rPr>
-          <w:rFonts w:ascii="Arial" w:eastAsia="Arial" w:hAnsi="Arial" w:cs="Arial"/>
-          <w:color w:val="808080"/>
-          <w:sz w:val="28"/>
-          <w:szCs w:val="28"/>
-        </w:rPr>
-        <w:t xml:space="preserve">afasta</w:t>
-      </w:r>
-      <w:r>
-        <w:rPr>
-          <w:rFonts w:ascii="Arial" w:eastAsia="Arial" w:hAnsi="Arial" w:cs="Arial"/>
-          <w:sz w:val="28"/>
-          <w:szCs w:val="28"/>
-        </w:rPr>
-        <w:t xml:space="preserve"> </w:t>
-      </w:r>
-      <w:r>
-        <w:rPr>
-          <w:rFonts w:ascii="Arial" w:eastAsia="Arial" w:hAnsi="Arial" w:cs="Arial"/>
-          <w:color w:val="808080"/>
-          <w:sz w:val="28"/>
-          <w:szCs w:val="28"/>
-        </w:rPr>
-        <w:t xml:space="preserve">o</w:t>
-      </w:r>
-      <w:r>
-        <w:rPr>
-          <w:rFonts w:ascii="Arial" w:eastAsia="Arial" w:hAnsi="Arial" w:cs="Arial"/>
-          <w:sz w:val="28"/>
-          <w:szCs w:val="28"/>
-        </w:rPr>
-        <w:t xml:space="preserve"> dever de indenizar.</w:t>
+          <w:highlight w:val="yellow"/>
+        </w:rPr>
+        <w:t xml:space="preserve">dever de indenizar</w:t>
+      </w:r>
+      <w:r>
+        <w:rPr>
+          <w:rFonts w:ascii="Arial" w:eastAsia="Arial" w:hAnsi="Arial" w:cs="Arial"/>
+          <w:color w:val="808080"/>
+          <w:sz w:val="28"/>
+          <w:szCs w:val="28"/>
+          <w:highlight w:val="yellow"/>
+        </w:rPr>
+        <w:t xml:space="preserve">, e o comprometimento da renda e o saldo negativo, por si sós, não ofendem direito da personalidade</w:t>
+      </w:r>
+      <w:r>
+        <w:rPr>
+          <w:rFonts w:ascii="Arial" w:eastAsia="Arial" w:hAnsi="Arial" w:cs="Arial"/>
+          <w:sz w:val="28"/>
+          <w:szCs w:val="28"/>
+          <w:highlight w:val="yellow"/>
+        </w:rPr>
+        <w:t xml:space="preserve">.</w:t>
       </w:r>
     </w:p>
     <w:p>
@@ -7224,92 +7153,40 @@
         <w:spacing w:after="0" w:line="360" w:lineRule="auto"/>
         <w:ind w:firstLine="2268"/>
         <w:jc w:val="both"/>
-        <w:rPr/>
-      </w:pPr>
-      <w:r>
-        <w:rPr>
-          <w:rFonts w:ascii="Arial" w:eastAsia="Arial" w:hAnsi="Arial" w:cs="Arial"/>
-          <w:color w:val="808080"/>
-          <w:sz w:val="28"/>
-          <w:szCs w:val="28"/>
-          <w:highlight w:val="yellow"/>
-        </w:rPr>
-        <w:t xml:space="preserve">O</w:t>
-      </w:r>
-      <w:r>
-        <w:rPr>
-          <w:rFonts w:ascii="Arial" w:eastAsia="Arial" w:hAnsi="Arial" w:cs="Arial"/>
-          <w:sz w:val="28"/>
-          <w:szCs w:val="28"/>
-          <w:highlight w:val="yellow"/>
-        </w:rPr>
-        <w:t xml:space="preserve"> comprometimento </w:t>
-      </w:r>
-      <w:r>
-        <w:rPr>
-          <w:rFonts w:ascii="Arial" w:eastAsia="Arial" w:hAnsi="Arial" w:cs="Arial"/>
-          <w:color w:val="808080"/>
-          <w:sz w:val="28"/>
-          <w:szCs w:val="28"/>
-          <w:highlight w:val="yellow"/>
-        </w:rPr>
-        <w:t xml:space="preserve">da</w:t>
-      </w:r>
-      <w:r>
-        <w:rPr>
-          <w:rFonts w:ascii="Arial" w:eastAsia="Arial" w:hAnsi="Arial" w:cs="Arial"/>
-          <w:sz w:val="28"/>
-          <w:szCs w:val="28"/>
-          <w:highlight w:val="yellow"/>
-        </w:rPr>
-        <w:t xml:space="preserve"> renda e </w:t>
-      </w:r>
-      <w:r>
-        <w:rPr>
-          <w:rFonts w:ascii="Arial" w:eastAsia="Arial" w:hAnsi="Arial" w:cs="Arial"/>
-          <w:color w:val="808080"/>
-          <w:sz w:val="28"/>
-          <w:szCs w:val="28"/>
-          <w:highlight w:val="yellow"/>
-        </w:rPr>
-        <w:t xml:space="preserve">a</w:t>
-      </w:r>
-      <w:r>
-        <w:rPr>
-          <w:rFonts w:ascii="Arial" w:eastAsia="Arial" w:hAnsi="Arial" w:cs="Arial"/>
-          <w:sz w:val="28"/>
-          <w:szCs w:val="28"/>
-          <w:highlight w:val="yellow"/>
-        </w:rPr>
-        <w:t xml:space="preserve"> manutenção de saldo negativo em conta, </w:t>
-      </w:r>
-      <w:r>
-        <w:rPr>
-          <w:rFonts w:ascii="Arial" w:eastAsia="Arial" w:hAnsi="Arial" w:cs="Arial"/>
-          <w:sz w:val="28"/>
-          <w:szCs w:val="28"/>
-          <w:highlight w:val="yellow"/>
-        </w:rPr>
-        <w:t xml:space="preserve">por si </w:t>
-      </w:r>
-      <w:r>
-        <w:rPr>
-          <w:rFonts w:ascii="Arial" w:eastAsia="Arial" w:hAnsi="Arial" w:cs="Arial"/>
-          <w:color w:val="808080"/>
-          <w:sz w:val="28"/>
-          <w:szCs w:val="28"/>
-          <w:highlight w:val="yellow"/>
-        </w:rPr>
-        <w:t xml:space="preserve">sós</w:t>
-      </w:r>
-      <w:r>
-        <w:rPr>
-          <w:rFonts w:ascii="Arial" w:eastAsia="Arial" w:hAnsi="Arial" w:cs="Arial"/>
-          <w:sz w:val="28"/>
-          <w:szCs w:val="28"/>
-          <w:highlight w:val="yellow"/>
-        </w:rPr>
-        <w:t xml:space="preserve">, não configuram lesão a direito da personalidade.</w:t>
+      </w:pPr>
+      <w:r>
+        <w:rPr>
+          <w:rFonts w:ascii="Arial" w:eastAsia="Arial" w:hAnsi="Arial" w:cs="Arial"/>
+          <w:color w:val="808080"/>
+          <w:sz w:val="28"/>
+          <w:szCs w:val="28"/>
+        </w:rPr>
+        <w:t xml:space="preserve">Nesse</w:t>
+      </w:r>
+      <w:r>
+        <w:rPr>
+          <w:rFonts w:ascii="Arial" w:eastAsia="Arial" w:hAnsi="Arial" w:cs="Arial"/>
+          <w:sz w:val="28"/>
+          <w:szCs w:val="28"/>
+        </w:rPr>
+        <w:t xml:space="preserve"> </w:t>
+      </w:r>
+      <w:r>
+        <w:rPr>
+          <w:rFonts w:ascii="Arial" w:eastAsia="Arial" w:hAnsi="Arial" w:cs="Arial"/>
+          <w:color w:val="808080"/>
+          <w:sz w:val="28"/>
+          <w:szCs w:val="28"/>
+        </w:rPr>
+        <w:t xml:space="preserve">sentido</w:t>
+      </w:r>
+      <w:r>
+        <w:rPr>
+          <w:rFonts w:ascii="Arial" w:eastAsia="Arial" w:hAnsi="Arial" w:cs="Arial"/>
+          <w:sz w:val="28"/>
+          <w:szCs w:val="28"/>
+        </w:rPr>
+        <w:t xml:space="preserve">:</w:t>
       </w:r>
     </w:p>
     <w:p>
@@ -7317,241 +7194,12 @@
         <w:spacing w:after="0" w:line="360" w:lineRule="auto"/>
         <w:ind w:firstLine="2268"/>
         <w:jc w:val="both"/>
-        <w:rPr/>
-      </w:pPr>
-    </w:p>
-    <w:p>
-      <w:pPr>
-        <w:spacing w:after="0" w:line="360" w:lineRule="auto"/>
-        <w:ind w:firstLine="2268"/>
-        <w:jc w:val="both"/>
-        <w:rPr>
-          <w:rFonts w:ascii="Arial" w:eastAsia="Arial" w:hAnsi="Arial" w:cs="Arial"/>
-          <w:sz w:val="28"/>
-          <w:szCs w:val="28"/>
-        </w:rPr>
-      </w:pPr>
-      <w:r>
-        <w:rPr>
-          <w:rFonts w:ascii="Arial" w:eastAsia="Arial" w:hAnsi="Arial" w:cs="Arial"/>
-          <w:sz w:val="28"/>
-          <w:szCs w:val="28"/>
-        </w:rPr>
-        <w:t xml:space="preserve">Os fatos narrados </w:t>
-      </w:r>
-      <w:r>
-        <w:rPr>
-          <w:rFonts w:ascii="Arial" w:eastAsia="Arial" w:hAnsi="Arial" w:cs="Arial"/>
-          <w:color w:val="808080"/>
-          <w:sz w:val="28"/>
-          <w:szCs w:val="28"/>
-        </w:rPr>
-        <w:t xml:space="preserve">são</w:t>
-      </w:r>
-      <w:r>
-        <w:rPr>
-          <w:rFonts w:ascii="Arial" w:eastAsia="Arial" w:hAnsi="Arial" w:cs="Arial"/>
-          <w:sz w:val="28"/>
-          <w:szCs w:val="28"/>
-        </w:rPr>
-        <w:t xml:space="preserve"> efeitos patrimoniais</w:t>
-      </w:r>
-      <w:r>
-        <w:rPr>
-          <w:rFonts w:ascii="Arial" w:eastAsia="Arial" w:hAnsi="Arial" w:cs="Arial"/>
-          <w:sz w:val="28"/>
-          <w:szCs w:val="28"/>
-        </w:rPr>
-        <w:t xml:space="preserve"> do cumprimento de obrigações </w:t>
-      </w:r>
-      <w:r>
-        <w:rPr>
-          <w:rFonts w:ascii="Arial" w:eastAsia="Arial" w:hAnsi="Arial" w:cs="Arial"/>
-          <w:color w:val="808080"/>
-          <w:sz w:val="28"/>
-          <w:szCs w:val="28"/>
-        </w:rPr>
-        <w:t xml:space="preserve">assumidas</w:t>
-      </w:r>
-      <w:r>
-        <w:rPr>
-          <w:rFonts w:ascii="Arial" w:eastAsia="Arial" w:hAnsi="Arial" w:cs="Arial"/>
-          <w:sz w:val="28"/>
-          <w:szCs w:val="28"/>
-        </w:rPr>
-        <w:t xml:space="preserve"> </w:t>
-      </w:r>
-      <w:r>
-        <w:rPr>
-          <w:rFonts w:ascii="Arial" w:eastAsia="Arial" w:hAnsi="Arial" w:cs="Arial"/>
-          <w:color w:val="808080"/>
-          <w:sz w:val="28"/>
-          <w:szCs w:val="28"/>
-        </w:rPr>
-        <w:t xml:space="preserve">pela autora e</w:t>
-      </w:r>
-      <w:r>
-        <w:rPr>
-          <w:rFonts w:ascii="Arial" w:eastAsia="Arial" w:hAnsi="Arial" w:cs="Arial"/>
-          <w:sz w:val="28"/>
-          <w:szCs w:val="28"/>
-        </w:rPr>
-        <w:t xml:space="preserve"> não </w:t>
-      </w:r>
-      <w:r>
-        <w:rPr>
-          <w:rFonts w:ascii="Arial" w:eastAsia="Arial" w:hAnsi="Arial" w:cs="Arial"/>
-          <w:color w:val="808080"/>
-          <w:sz w:val="28"/>
-          <w:szCs w:val="28"/>
-        </w:rPr>
-        <w:t xml:space="preserve">evidenciam</w:t>
-      </w:r>
-      <w:r>
-        <w:rPr>
-          <w:rFonts w:ascii="Arial" w:eastAsia="Arial" w:hAnsi="Arial" w:cs="Arial"/>
-          <w:sz w:val="28"/>
-          <w:szCs w:val="28"/>
-        </w:rPr>
-        <w:t xml:space="preserve"> ofensa à honra, à imagem, à intimidade ou à dignidade da consumidora</w:t>
-      </w:r>
-      <w:r>
-        <w:rPr>
-          <w:rFonts w:ascii="Arial" w:eastAsia="Arial" w:hAnsi="Arial" w:cs="Arial"/>
-          <w:sz w:val="28"/>
-          <w:szCs w:val="28"/>
-        </w:rPr>
-        <w:t xml:space="preserve">.</w:t>
-      </w:r>
-    </w:p>
-    <w:p>
-      <w:pPr>
-        <w:spacing w:after="0" w:line="360" w:lineRule="auto"/>
-        <w:ind w:firstLine="2268"/>
-        <w:jc w:val="both"/>
-        <w:rPr>
-          <w:rFonts w:ascii="Arial" w:eastAsia="Arial" w:hAnsi="Arial" w:cs="Arial"/>
-          <w:sz w:val="28"/>
-          <w:szCs w:val="28"/>
-        </w:rPr>
-      </w:pPr>
-    </w:p>
-    <w:p>
-      <w:pPr>
-        <w:spacing w:after="0" w:line="360" w:lineRule="auto"/>
-        <w:ind w:firstLine="2268"/>
-        <w:jc w:val="both"/>
-      </w:pPr>
-      <w:r>
-        <w:rPr>
-          <w:rFonts w:ascii="Arial" w:eastAsia="Arial" w:hAnsi="Arial" w:cs="Arial"/>
-          <w:color w:val="808080"/>
-          <w:sz w:val="28"/>
-          <w:szCs w:val="28"/>
-        </w:rPr>
-        <w:t xml:space="preserve">Nesse</w:t>
-      </w:r>
-      <w:r>
-        <w:rPr>
-          <w:rFonts w:ascii="Arial" w:eastAsia="Arial" w:hAnsi="Arial" w:cs="Arial"/>
-          <w:sz w:val="28"/>
-          <w:szCs w:val="28"/>
-        </w:rPr>
-        <w:t xml:space="preserve"> </w:t>
-      </w:r>
-      <w:r>
-        <w:rPr>
-          <w:rFonts w:ascii="Arial" w:eastAsia="Arial" w:hAnsi="Arial" w:cs="Arial"/>
-          <w:color w:val="808080"/>
-          <w:sz w:val="28"/>
-          <w:szCs w:val="28"/>
-        </w:rPr>
-        <w:t xml:space="preserve">sentido</w:t>
-      </w:r>
-      <w:r>
-        <w:rPr>
-          <w:rFonts w:ascii="Arial" w:eastAsia="Arial" w:hAnsi="Arial" w:cs="Arial"/>
-          <w:sz w:val="28"/>
-          <w:szCs w:val="28"/>
-        </w:rPr>
-        <w:t xml:space="preserve">:</w:t>
-      </w:r>
-    </w:p>
-    <w:p>
-      <w:pPr>
-        <w:spacing w:after="0" w:line="360" w:lineRule="auto"/>
-        <w:ind w:firstLine="2268"/>
-        <w:jc w:val="both"/>
-        <w:rPr>
-          <w:rFonts w:ascii="Arial" w:eastAsia="Arial" w:hAnsi="Arial" w:cs="Arial"/>
-          <w:sz w:val="28"/>
-          <w:szCs w:val="28"/>
-        </w:rPr>
-      </w:pPr>
-    </w:p>
-    <w:p>
-      <w:pPr>
-        <w:spacing w:after="0" w:line="360" w:lineRule="auto"/>
-        <w:ind w:left="2268"/>
-        <w:jc w:val="both"/>
-        <w:rPr>
-          <w:rFonts w:ascii="Arial" w:eastAsia="Arial" w:hAnsi="Arial" w:cs="Arial"/>
-          <w:i/>
-          <w:iCs/>
-          <w:sz w:val="26"/>
-          <w:szCs w:val="26"/>
-        </w:rPr>
-      </w:pPr>
-      <w:r>
-        <w:rPr>
-          <w:rFonts w:ascii="Arial" w:eastAsia="Arial" w:hAnsi="Arial" w:cs="Arial"/>
-          <w:i/>
-          <w:iCs/>
-          <w:sz w:val="26"/>
-          <w:szCs w:val="26"/>
-        </w:rPr>
-        <w:t>"</w:t>
-      </w:r>
-      <w:r>
-        <w:rPr>
-          <w:rFonts w:ascii="Arial" w:eastAsia="Arial" w:hAnsi="Arial" w:cs="Arial"/>
-          <w:i/>
-          <w:iCs/>
-          <w:sz w:val="26"/>
-          <w:szCs w:val="26"/>
-        </w:rPr>
-        <w:t>(...)</w:t>
-      </w:r>
-      <w:r>
-        <w:rPr>
-          <w:rFonts w:ascii="Arial" w:eastAsia="Arial" w:hAnsi="Arial" w:cs="Arial"/>
-          <w:i/>
-          <w:iCs/>
-          <w:sz w:val="26"/>
-          <w:szCs w:val="26"/>
-        </w:rPr>
-        <w:t xml:space="preserve"> </w:t>
-      </w:r>
-      <w:r>
-        <w:rPr>
-          <w:rFonts w:ascii="Arial" w:eastAsia="Arial" w:hAnsi="Arial" w:cs="Arial"/>
-          <w:i/>
-          <w:iCs/>
-          <w:sz w:val="26"/>
-          <w:szCs w:val="26"/>
-        </w:rPr>
-        <w:t xml:space="preserve">4. </w:t>
-      </w:r>
-      <w:r>
-        <w:rPr>
-          <w:rFonts w:ascii="Arial" w:eastAsia="Arial" w:hAnsi="Arial" w:cs="Arial"/>
-          <w:i/>
-          <w:iCs/>
-          <w:sz w:val="26"/>
-          <w:szCs w:val="26"/>
-        </w:rPr>
-        <w:t>O Tema 1.085 do STJ reconhece a licitude dos descontos em conta corrente desde que previamente autorizados pelo mutuário e enquanto perdurar a autorização concedida.</w:t>
-      </w:r>
+        <w:rPr>
+          <w:rFonts w:ascii="Arial" w:eastAsia="Arial" w:hAnsi="Arial" w:cs="Arial"/>
+          <w:sz w:val="28"/>
+          <w:szCs w:val="28"/>
+        </w:rPr>
+      </w:pPr>
     </w:p>
     <w:p>
       <w:pPr>
@@ -7561,19 +7209,22 @@
         <w:contextualSpacing w:val="0"/>
         <w:jc w:val="both"/>
         <w:rPr>
-          <w:sz w:val="26"/>
-          <w:szCs w:val="26"/>
-        </w:rPr>
-      </w:pPr>
-      <w:r>
-        <w:rPr>
-          <w:rFonts w:ascii="Arial" w:eastAsia="Arial" w:hAnsi="Arial" w:cs="Arial"/>
           <w:i/>
           <w:iCs/>
           <w:sz w:val="26"/>
           <w:szCs w:val="26"/>
         </w:rPr>
-        <w:t>(...)</w:t>
+      </w:pPr>
+      <w:r>
+        <w:rPr>
+          <w:rFonts w:ascii="Arial" w:eastAsia="Arial" w:hAnsi="Arial" w:cs="Arial"/>
+          <w:i/>
+          <w:iCs/>
+          <w:color w:val="808080"/>
+          <w:sz w:val="26"/>
+          <w:szCs w:val="26"/>
+        </w:rPr>
+        <w:t xml:space="preserve">"</w:t>
       </w:r>
       <w:r>
         <w:rPr>
@@ -7583,7 +7234,7 @@
           <w:sz w:val="26"/>
           <w:szCs w:val="26"/>
         </w:rPr>
-        <w:t xml:space="preserve"> </w:t>
+        <w:t xml:space="preserve">(...)</w:t>
       </w:r>
       <w:r>
         <w:rPr>
@@ -7593,7 +7244,17 @@
           <w:sz w:val="26"/>
           <w:szCs w:val="26"/>
         </w:rPr>
-        <w:t xml:space="preserve">15. </w:t>
+        <w:t xml:space="preserve"> </w:t>
+      </w:r>
+      <w:r>
+        <w:rPr>
+          <w:rFonts w:ascii="Arial" w:eastAsia="Arial" w:hAnsi="Arial" w:cs="Arial"/>
+          <w:i/>
+          <w:iCs/>
+          <w:sz w:val="26"/>
+          <w:szCs w:val="26"/>
+        </w:rPr>
+        <w:t xml:space="preserve">5. A manutenção dos descontos decorrentes de contrato válido, antes do reconhecimento judicial da revogação da autorização, </w:t>
       </w:r>
       <w:r>
         <w:rPr>
@@ -7604,7 +7265,7 @@
           <w:szCs w:val="26"/>
           <w:u w:val="single"/>
         </w:rPr>
-        <w:t xml:space="preserve">Também não se configura dano moral, uma vez que os descontos decorreram da execução de contratos válidos</w:t>
+        <w:t xml:space="preserve">não configura dano moral indenizável</w:t>
       </w:r>
       <w:r>
         <w:rPr>
@@ -7614,23 +7275,18 @@
           <w:sz w:val="26"/>
           <w:szCs w:val="26"/>
         </w:rPr>
-        <w:t xml:space="preserve"> e não evidenciam violação aos direitos da personalidade nem situação excepcional apta a justificar compensação extrapatrimonial. </w:t>
-      </w:r>
-    </w:p>
-    <w:p>
-      <w:pPr>
-        <w:pStyle w:val="PargrafodaLista"/>
-        <w:spacing w:after="0" w:line="360" w:lineRule="auto"/>
-        <w:ind w:left="2268"/>
-        <w:contextualSpacing w:val="0"/>
-        <w:jc w:val="both"/>
-        <w:rPr>
+        <w:t xml:space="preserve">.</w:t>
+      </w:r>
+      <w:r>
+        <w:rPr>
+          <w:rFonts w:ascii="Arial" w:eastAsia="Arial" w:hAnsi="Arial" w:cs="Arial"/>
           <w:i/>
           <w:iCs/>
           <w:sz w:val="26"/>
           <w:szCs w:val="26"/>
         </w:rPr>
-      </w:pPr>
+        <w:t xml:space="preserve"> (...)</w:t>
+      </w:r>
       <w:r>
         <w:rPr>
           <w:rFonts w:ascii="Arial" w:eastAsia="Arial" w:hAnsi="Arial" w:cs="Arial"/>
@@ -7639,7 +7295,15 @@
           <w:sz w:val="26"/>
           <w:szCs w:val="26"/>
         </w:rPr>
-        <w:t xml:space="preserve">(...)</w:t>
+        <w:t xml:space="preserve">"</w:t>
+      </w:r>
+      <w:r>
+        <w:rPr>
+          <w:rFonts w:ascii="Arial" w:eastAsia="Arial" w:hAnsi="Arial" w:cs="Arial"/>
+          <w:sz w:val="26"/>
+          <w:szCs w:val="26"/>
+        </w:rPr>
+        <w:t xml:space="preserve"> </w:t>
       </w:r>
       <w:r>
         <w:rPr>
@@ -7649,7 +7313,7 @@
           <w:sz w:val="26"/>
           <w:szCs w:val="26"/>
         </w:rPr>
-        <w:t xml:space="preserve"> </w:t>
+        <w:t xml:space="preserve">(Acórdão 2153707, 0705661-65.2024.8.07.0014, Relator(a): EDI MARIA COUTINHO BIZZI, Relator(a) Designado(a): MÁRIO-ZAM BELMIRO, 4ª TURMA CÍVEL, data de julgamento: 22/07/2026, publicado no DJe: 30/07/2026)</w:t>
       </w:r>
       <w:r>
         <w:rPr>
@@ -7659,54 +7323,6 @@
           <w:sz w:val="26"/>
           <w:szCs w:val="26"/>
         </w:rPr>
-        <w:t xml:space="preserve">5. A manutenção dos descontos decorrentes de contrato válido, antes do reconhecimento judicial da revogação da autorização, não configura dano moral indenizável.</w:t>
-      </w:r>
-      <w:r>
-        <w:rPr>
-          <w:rFonts w:ascii="Arial" w:eastAsia="Arial" w:hAnsi="Arial" w:cs="Arial"/>
-          <w:i/>
-          <w:iCs/>
-          <w:sz w:val="26"/>
-          <w:szCs w:val="26"/>
-        </w:rPr>
-        <w:t xml:space="preserve"> (...)</w:t>
-      </w:r>
-      <w:r>
-        <w:rPr>
-          <w:rFonts w:ascii="Arial" w:eastAsia="Arial" w:hAnsi="Arial" w:cs="Arial"/>
-          <w:i/>
-          <w:iCs/>
-          <w:sz w:val="26"/>
-          <w:szCs w:val="26"/>
-        </w:rPr>
-        <w:t xml:space="preserve">"</w:t>
-      </w:r>
-      <w:r>
-        <w:rPr>
-          <w:rFonts w:ascii="Arial" w:eastAsia="Arial" w:hAnsi="Arial" w:cs="Arial"/>
-          <w:sz w:val="26"/>
-          <w:szCs w:val="26"/>
-        </w:rPr>
-        <w:t xml:space="preserve"> </w:t>
-      </w:r>
-      <w:r>
-        <w:rPr>
-          <w:rFonts w:ascii="Arial" w:eastAsia="Arial" w:hAnsi="Arial" w:cs="Arial"/>
-          <w:i/>
-          <w:iCs/>
-          <w:sz w:val="26"/>
-          <w:szCs w:val="26"/>
-        </w:rPr>
-        <w:t xml:space="preserve">(Acórdão 2153707, 0705661-65.2024.8.07.0014, Relator(a): EDI MARIA COUTINHO BIZZI, Relator(a) Designado(a): MÁRIO-ZAM BELMIRO, 4ª TURMA CÍVEL, data de julgamento: 22/07/2026, publicado no DJe: 30/07/2026)</w:t>
-      </w:r>
-      <w:r>
-        <w:rPr>
-          <w:rFonts w:ascii="Arial" w:eastAsia="Arial" w:hAnsi="Arial" w:cs="Arial"/>
-          <w:i/>
-          <w:iCs/>
-          <w:sz w:val="26"/>
-          <w:szCs w:val="26"/>
-        </w:rPr>
         <w:t xml:space="preserve"> </w:t>
       </w:r>
       <w:r>
@@ -8399,6 +8015,57 @@
           <w:color w:val="00B050"/>
         </w:rPr>
         <w:t>Após o trânsito em julgado, não havendo outros requerimentos, arquivem-se os autos</w:t>
+      </w:r>
+    </w:p>
+    <w:p>
+      <w:pPr>
+        <w:jc w:val="both"/>
+        <w:rPr>
+          <w:rFonts w:ascii="Calibri" w:eastAsia="Calibri" w:hAnsi="Calibri" w:cs="Calibri"/>
+          <w:color w:val="70AD47" w:themeColor="accent6"/>
+        </w:rPr>
+      </w:pPr>
+    </w:p>
+    <w:p>
+      <w:pPr>
+        <w:jc w:val="both"/>
+        <w:rPr>
+          <w:rFonts w:ascii="Calibri" w:eastAsia="Calibri" w:hAnsi="Calibri" w:cs="Calibri"/>
+          <w:color w:val="70AD47" w:themeColor="accent6"/>
+        </w:rPr>
+      </w:pPr>
+      <w:r>
+        <w:rPr>
+          <w:rFonts w:ascii="Calibri" w:eastAsia="Calibri" w:hAnsi="Calibri" w:cs="Calibri"/>
+          <w:b/>
+          <w:color w:val="800080"/>
+        </w:rPr>
+        <w:t xml:space="preserve">PRECEDENTES CONTRÁRIOS AO VOTO</w:t>
+      </w:r>
+    </w:p>
+    <w:p>
+      <w:pPr>
+        <w:jc w:val="both"/>
+        <w:rPr>
+          <w:rFonts w:ascii="Calibri" w:eastAsia="Calibri" w:hAnsi="Calibri" w:cs="Calibri"/>
+          <w:color w:val="70AD47" w:themeColor="accent6"/>
+        </w:rPr>
+      </w:pPr>
+    </w:p>
+    <w:p>
+      <w:pPr>
+        <w:jc w:val="both"/>
+        <w:rPr>
+          <w:rFonts w:ascii="Calibri" w:eastAsia="Calibri" w:hAnsi="Calibri" w:cs="Calibri"/>
+          <w:color w:val="70AD47" w:themeColor="accent6"/>
+        </w:rPr>
+      </w:pPr>
+      <w:r>
+        <w:rPr>
+          <w:b w:val="0"/>
+          <w:color w:val="800080"/>
+        </w:rPr>
+        <w:t xml:space="preserve">"1. É defeso à instituição financeira, em nítido exercício de autotutela, reter integralmente os valores depositados em conta bancária relativos ao salário do correntista para amortizar parcelas pendentes de pagamento, porquanto é imprescindível preservar a manutenção do mínimo existencial do devedor e/ou de sua família. 2. Conforme pacífica jurisprudência do colendo STJ, a retenção integral do salário da correntista resulta em ilícito passível de indenização por dano moral. 3.1. “Quantum” fixado a esse título - R$ 3.000,00 (três mil reais) - em consonância com os requisitos para tal mister. 3. Recurso do autor conhecido e provido. Recurso do banco réu desprovido." (Acórdão 2118786, 0705596-18.2025.8.07.0020, Relator(a): ROBSON BARBOSA DE AZEVEDO, 7ª TURMA CÍVEL, data de julgamento: 29/04/2026, publicado no DJe: 18/05/2026.)</w:t>
       </w:r>
     </w:p>
     <w:p>
@@ -8469,7 +8136,7 @@
       </w:r>
     </w:p>
   </w:comment>
-  <w:comment w:id="2" w:author="Assessor GDSXSR" w:initials="RG" w:date="2026-10-29T21:14:30Z">
+  <w:comment w:id="2" w:author="Assessor GDSXSR" w:initials="RG" w:date="2026-10-30T19:45:25Z">
     <w:p>
       <w:pPr>
         <w:pStyle w:val="CommentText"/>
@@ -8481,11 +8148,11 @@
         <w:annotationRef/>
       </w:r>
       <w:r>
-        <w:t>ASSESSOR GDSXSR — Revisão geral sem autos: não recebi o PDF do processo, então fatos, datas, IDs e o nome da juíza ficam como na minuta e na sentença anexada (C-24). Alterações mecânicas: supressão de 'Requer o não provimento do recurso.' (C-31), recuos, negrito das enumerações, referências compactas ('CPC 85 § 11', C-20), espaçamento do relatório, cor verde 00B050 da sentença anexada (C-45) e 'EMENTA' à esquerda (C-42). O resultado (nego provimento) foi mantido (C-03).</w:t>
+        <w:t>ASSESSOR GDSXSR — Revisão complementada com os autos de origem (PJe, Num. 88900897 a 88901980): datas, IDs, nome da juíza e cláusula contratual conferidos (C-24). Concisão: fundamentação do voto e ementa reduzidas, com a sentença e os acórdãos em transcrição parcial (...) e supressão de parágrafos repetitivos (C-02, C-62). Alterações mecânicas: supressão de 'Requer o não provimento do recurso.' (C-31), recuos, negrito das enumerações, referências compactas ('CPC 85 § 11', C-20), espaçamento do relatório, cor verde 00B050 da sentença anexada (C-45) e 'EMENTA' à esquerda (C-42). O resultado (nego provimento) foi mantido (C-03).</w:t>
       </w:r>
     </w:p>
   </w:comment>
-  <w:comment w:id="3" w:author="Assessor GDSXSR" w:initials="RG" w:date="2026-10-29T21:14:30Z">
+  <w:comment w:id="3" w:author="Assessor GDSXSR" w:initials="RG" w:date="2026-10-30T19:45:25Z">
     <w:p>
       <w:pPr>
         <w:pStyle w:val="CommentText"/>
@@ -8501,7 +8168,7 @@
       </w:r>
     </w:p>
   </w:comment>
-  <w:comment w:id="4" w:author="Assessor GDSXSR" w:initials="RG" w:date="2026-10-29T21:14:30Z">
+  <w:comment w:id="4" w:author="Assessor GDSXSR" w:initials="RG" w:date="2026-10-30T19:45:25Z">
     <w:p>
       <w:pPr>
         <w:pStyle w:val="CommentText"/>
@@ -8513,11 +8180,11 @@
         <w:annotationRef/>
       </w:r>
       <w:r>
-        <w:t>ASSESSOR GDSXSR — Alterei a redação para refletir a tese do Tema 1.085/STJ, que limita a licitude dos descontos ao período em que a autorização perdurar (tese literal no corpo do voto, C-61). Item 'Tema 1.085/STJ' no formato de C-20.</w:t>
+        <w:t>ASSESSOR GDSXSR — Alterei a redação para refletir a tese do Tema 1.085/STJ, que limita a licitude dos descontos ao período em que a autorização perdurar (tese literal no corpo do voto, C-61), em redação mais curta (C-02).</w:t>
       </w:r>
     </w:p>
   </w:comment>
-  <w:comment w:id="5" w:author="Assessor GDSXSR" w:initials="RG" w:date="2026-10-29T21:14:30Z">
+  <w:comment w:id="5" w:author="Assessor GDSXSR" w:initials="RG" w:date="2026-10-30T19:45:25Z">
     <w:p>
       <w:pPr>
         <w:pStyle w:val="CommentText"/>
@@ -8533,7 +8200,7 @@
       </w:r>
     </w:p>
   </w:comment>
-  <w:comment w:id="6" w:author="Assessor GDSXSR" w:initials="RG" w:date="2026-10-29T21:14:30Z">
+  <w:comment w:id="6" w:author="Assessor GDSXSR" w:initials="RG" w:date="2026-10-30T19:45:25Z">
     <w:p>
       <w:pPr>
         <w:pStyle w:val="CommentText"/>
@@ -8549,7 +8216,7 @@
       </w:r>
     </w:p>
   </w:comment>
-  <w:comment w:id="7" w:author="Assessor GDSXSR" w:initials="RG" w:date="2026-10-29T21:14:30Z">
+  <w:comment w:id="7" w:author="Assessor GDSXSR" w:initials="RG" w:date="2026-10-30T19:45:25Z">
     <w:p>
       <w:pPr>
         <w:pStyle w:val="CommentText"/>
@@ -8565,7 +8232,7 @@
       </w:r>
     </w:p>
   </w:comment>
-  <w:comment w:id="8" w:author="Assessor GDSXSR" w:initials="RG" w:date="2026-10-29T21:14:30Z">
+  <w:comment w:id="8" w:author="Assessor GDSXSR" w:initials="RG" w:date="2026-10-30T19:45:25Z">
     <w:p>
       <w:pPr>
         <w:pStyle w:val="CommentText"/>
@@ -8581,7 +8248,7 @@
       </w:r>
     </w:p>
   </w:comment>
-  <w:comment w:id="9" w:author="Assessor GDSXSR" w:initials="RG" w:date="2026-10-29T21:14:30Z">
+  <w:comment w:id="9" w:author="Assessor GDSXSR" w:initials="RG" w:date="2026-10-30T19:45:25Z">
     <w:p>
       <w:pPr>
         <w:pStyle w:val="CommentText"/>
@@ -8597,7 +8264,7 @@
       </w:r>
     </w:p>
   </w:comment>
-  <w:comment w:id="10" w:author="Assessor GDSXSR" w:initials="RG" w:date="2026-10-29T21:14:30Z">
+  <w:comment w:id="10" w:author="Assessor GDSXSR" w:initials="RG" w:date="2026-10-30T19:45:25Z">
     <w:p>
       <w:pPr>
         <w:pStyle w:val="CommentText"/>
@@ -8609,11 +8276,11 @@
         <w:annotationRef/>
       </w:r>
       <w:r>
-        <w:t>ASSESSOR GDSXSR — 'MMa.' para 'MM.' (fórmula do perfil APC). O nome da juíza (Dra. Fernanda D'Aquino Mafra) não pôde ser conferido no PJe sem os autos; pendência de conferência (C-22, C-52).</w:t>
+        <w:t>ASSESSOR GDSXSR — 'MMa.' para 'MM.' (fórmula do perfil APC). Nome da juíza e vara conferidos na sentença (ID 88901975): Dra. Fernanda D'Aquino Mafra, 3ª Vara Cível de Taguatinga (C-22).</w:t>
       </w:r>
     </w:p>
   </w:comment>
-  <w:comment w:id="11" w:author="Assessor GDSXSR" w:initials="RG" w:date="2026-10-29T21:14:30Z">
+  <w:comment w:id="11" w:author="Assessor GDSXSR" w:initials="RG" w:date="2026-10-30T19:45:25Z">
     <w:p>
       <w:pPr>
         <w:pStyle w:val="CommentText"/>
@@ -8625,11 +8292,11 @@
         <w:annotationRef/>
       </w:r>
       <w:r>
-        <w:t>ASSESSOR GDSXSR — Corrigi erro material: o apelo é da autora, não do réu. Datas (ajuizamento 30/04/2026, sentença 26/05/2026, apelo 29/07/2026) e valor da causa mantidos como na minuta; pendência: conferir no PJe, sobretudo a data do apelo (C-24, C-52).</w:t>
+        <w:t>ASSESSOR GDSXSR — Corrigi erro material: o apelo é da autora, não do réu. Conferido nos autos: ajuizamento 30/04/2026 (petição inicial, ID 88900897); a sentença é de 08/07/2026 (ID 88901975), e não 26/05/2026; apelo de 29/07/2026 (ID 88901977); valor da causa R$ 36.000,00 (C-24).</w:t>
       </w:r>
     </w:p>
   </w:comment>
-  <w:comment w:id="12" w:author="Assessor GDSXSR" w:initials="RG" w:date="2026-10-29T21:14:30Z">
+  <w:comment w:id="12" w:author="Assessor GDSXSR" w:initials="RG" w:date="2026-10-30T19:45:25Z">
     <w:p>
       <w:pPr>
         <w:pStyle w:val="CommentText"/>
@@ -8645,7 +8312,7 @@
       </w:r>
     </w:p>
   </w:comment>
-  <w:comment w:id="13" w:author="Assessor GDSXSR" w:initials="RG" w:date="2026-10-29T21:14:30Z">
+  <w:comment w:id="13" w:author="Assessor GDSXSR" w:initials="RG" w:date="2026-10-30T19:45:25Z">
     <w:p>
       <w:pPr>
         <w:pStyle w:val="CommentText"/>
@@ -8661,7 +8328,7 @@
       </w:r>
     </w:p>
   </w:comment>
-  <w:comment w:id="14" w:author="Assessor GDSXSR" w:initials="RG" w:date="2026-10-29T21:14:30Z">
+  <w:comment w:id="14" w:author="Assessor GDSXSR" w:initials="RG" w:date="2026-10-30T19:45:25Z">
     <w:p>
       <w:pPr>
         <w:pStyle w:val="CommentText"/>
@@ -8673,11 +8340,11 @@
         <w:annotationRef/>
       </w:r>
       <w:r>
-        <w:t>ASSESSOR GDSXSR — Pendência: os contratos (IDs 88901966, 88901968 e 88901970) não vieram nos autos recebidos; a cláusula que autoriza o provisionamento e o débito deve ser transcrita literalmente, com o ID (C-66 b, C-52). Dividi o parágrafo (C-11) e levei os IDs ao fim do período, no singular e sem ponto (C-20, C-25).</w:t>
+        <w:t>ASSESSOR GDSXSR — Conferi os contratos nos autos: a cláusula de autorização de débito aparece, com a mesma redação, nos IDs 88901966, 88901967, 88901969 e 88901970 (a minuta citava 88901966, 88901968 e 88901970). Transcrevi-a literalmente do ID 88901966, com (...) no trecho do meio (C-66 b, C-62). Fundi os quatro parágrafos de fundamentação sobre contratos e sentença em um parágrafo de remissão, o fato do cancelamento e a conclusão (C-02, C-11, C-20, C-25).</w:t>
       </w:r>
     </w:p>
   </w:comment>
-  <w:comment w:id="15" w:author="Assessor GDSXSR" w:initials="RG" w:date="2026-10-29T21:14:30Z">
+  <w:comment w:id="15" w:author="Assessor GDSXSR" w:initials="RG" w:date="2026-10-30T19:45:25Z">
     <w:p>
       <w:pPr>
         <w:pStyle w:val="CommentText"/>
@@ -8689,11 +8356,11 @@
         <w:annotationRef/>
       </w:r>
       <w:r>
-        <w:t>ASSESSOR GDSXSR — Pendência: a r. sentença apoia-se no ID 273306192 do processo conexo nº 0709997-65.2026.8.07.0007 (pedido de cancelamento de 16/04/2026). O ID do voto remete à sentença (ID 88901975); conferir no PJe o documento do processo conexo (C-24, C-52).</w:t>
+        <w:t>ASSESSOR GDSXSR — Pendência: a r. sentença apoia-se no ID 273306192 do processo conexo nº 0709997-65.2026.8.07.0007 (pedido de cancelamento de 16/04/2026), que não consta destes autos. O ID do voto remete à sentença (ID 88901975); conferir o documento no processo conexo (C-24, C-52).</w:t>
       </w:r>
     </w:p>
   </w:comment>
-  <w:comment w:id="16" w:author="Assessor GDSXSR" w:initials="RG" w:date="2026-10-29T21:14:30Z">
+  <w:comment w:id="16" w:author="Assessor GDSXSR" w:initials="RG" w:date="2026-10-30T19:45:25Z">
     <w:p>
       <w:pPr>
         <w:pStyle w:val="CommentText"/>
@@ -8709,7 +8376,7 @@
       </w:r>
     </w:p>
   </w:comment>
-  <w:comment w:id="17" w:author="Assessor GDSXSR" w:initials="RG" w:date="2026-10-29T21:14:30Z">
+  <w:comment w:id="17" w:author="Assessor GDSXSR" w:initials="RG" w:date="2026-10-30T19:45:25Z">
     <w:p>
       <w:pPr>
         <w:pStyle w:val="CommentText"/>
@@ -8725,7 +8392,7 @@
       </w:r>
     </w:p>
   </w:comment>
-  <w:comment w:id="18" w:author="Assessor GDSXSR" w:initials="RG" w:date="2026-10-29T21:14:30Z">
+  <w:comment w:id="18" w:author="Assessor GDSXSR" w:initials="RG" w:date="2026-10-30T19:45:25Z">
     <w:p>
       <w:pPr>
         <w:pStyle w:val="CommentText"/>
@@ -8741,7 +8408,7 @@
       </w:r>
     </w:p>
   </w:comment>
-  <w:comment w:id="19" w:author="Assessor GDSXSR" w:initials="RG" w:date="2026-10-29T21:14:30Z">
+  <w:comment w:id="19" w:author="Assessor GDSXSR" w:initials="RG" w:date="2026-10-30T19:45:25Z">
     <w:p>
       <w:pPr>
         <w:pStyle w:val="CommentText"/>
@@ -8757,7 +8424,7 @@
       </w:r>
     </w:p>
   </w:comment>
-  <w:comment w:id="20" w:author="Assessor GDSXSR" w:initials="RG" w:date="2026-10-29T21:14:30Z">
+  <w:comment w:id="20" w:author="Assessor GDSXSR" w:initials="RG" w:date="2026-10-30T19:45:25Z">
     <w:p>
       <w:pPr>
         <w:pStyle w:val="CommentText"/>
@@ -8773,7 +8440,7 @@
       </w:r>
     </w:p>
   </w:comment>
-  <w:comment w:id="21" w:author="Assessor GDSXSR" w:initials="RG" w:date="2026-10-29T21:14:30Z">
+  <w:comment w:id="21" w:author="Assessor GDSXSR" w:initials="RG" w:date="2026-10-30T19:45:25Z">
     <w:p>
       <w:pPr>
         <w:pStyle w:val="CommentText"/>
@@ -8789,7 +8456,7 @@
       </w:r>
     </w:p>
   </w:comment>
-  <w:comment w:id="22" w:author="Assessor GDSXSR" w:initials="RG" w:date="2026-10-29T21:14:30Z">
+  <w:comment w:id="22" w:author="Assessor GDSXSR" w:initials="RG" w:date="2026-10-30T19:45:25Z">
     <w:p>
       <w:pPr>
         <w:pStyle w:val="CommentText"/>
@@ -8802,6 +8469,22 @@
       </w:r>
       <w:r>
         <w:t>ASSESSOR GDSXSR — Retirei o rótulo 'RESUMO COPILOT' (material de trabalho da ferramenta, em vermelho fora do bloco) e completei o título do resumo ('… EM SENTIDO CONTRÁRIO AO VOTO', C-39). O conteúdo do resumo não foi reescrito; permanecem nele as marcas '[apc 0710751-07 | PDF]' e a numeração automática corrida, do Copilot (C-39).</w:t>
+      </w:r>
+    </w:p>
+  </w:comment>
+  <w:comment w:id="23" w:author="Assessor GDSXSR" w:initials="RG" w:date="2026-10-30T19:45:25Z">
+    <w:p>
+      <w:pPr>
+        <w:pStyle w:val="CommentText"/>
+      </w:pPr>
+      <w:r>
+        <w:rPr>
+          <w:rStyle w:val="CommentReference"/>
+        </w:rPr>
+        <w:annotationRef/>
+      </w:r>
+      <w:r>
+        <w:t>ASSESSOR GDSXSR — Bloco em violeta no fim do documento (C-46, C-53): o apelo invoca o Acórdão 2118786 (7ª TC, Des. Robson Barbosa de Azevedo), em sentido contrário ao voto, que não foi enfrentado na minuta. Transcrevi a ementa como reproduzida no apelo (ID 88901977), sem o cabeçalho (C-62), e não escrevi parágrafo de distinção no corpo do voto. Pendência: o acórdão não foi localizado no iajus; conferir texto e dados no JurisDF (C-52). A distinção está nos autos: o precedente trata de retenção integral do salário para quitar parcelas pretéritas inadimplidas, sem autorização vigente discutida; a decisão de distinguir é do Desembargador.</w:t>
       </w:r>
     </w:p>
   </w:comment>

</xml_diff>